<commit_message>
Update documento Projeto de Extensão
</commit_message>
<xml_diff>
--- a/documentos/Documento - Projeto de Extensão - COM Empresa.docx
+++ b/documentos/Documento - Projeto de Extensão - COM Empresa.docx
@@ -135,29 +135,18 @@
             <w:pPr>
               <w:rPr>
                 <w:rFonts w:ascii="Arial" w:eastAsia="Arial" w:hAnsi="Arial" w:cs="Arial"/>
-                <w:color w:val="525252" w:themeColor="accent3" w:themeShade="80"/>
-                <w:sz w:val="20"/>
-                <w:szCs w:val="20"/>
-              </w:rPr>
-            </w:pPr>
-            <w:r>
-              <w:rPr>
-                <w:rFonts w:ascii="Arial" w:eastAsia="Arial" w:hAnsi="Arial" w:cs="Arial"/>
-                <w:color w:val="525252" w:themeColor="accent3" w:themeShade="80"/>
-                <w:sz w:val="20"/>
-                <w:szCs w:val="20"/>
-              </w:rPr>
-              <w:t>Inserir os dados neste espaço. Orientações: descrição sucinta englobando o tema do projeto.</w:t>
-            </w:r>
-          </w:p>
-          <w:p>
-            <w:pPr>
-              <w:rPr>
-                <w:rFonts w:ascii="Arial" w:eastAsia="Arial" w:hAnsi="Arial" w:cs="Arial"/>
-                <w:sz w:val="20"/>
-                <w:szCs w:val="20"/>
-              </w:rPr>
-            </w:pPr>
+                <w:sz w:val="20"/>
+                <w:szCs w:val="20"/>
+              </w:rPr>
+            </w:pPr>
+            <w:r>
+              <w:rPr>
+                <w:rFonts w:ascii="Arial" w:eastAsia="Arial" w:hAnsi="Arial" w:cs="Arial"/>
+                <w:sz w:val="20"/>
+                <w:szCs w:val="20"/>
+              </w:rPr>
+              <w:t>Aplicativo Android desenvolvido para auxiliar estudantes no controle de seus gastos acadêmicos, como cantina, boletos, biblioteca e livraria.</w:t>
+            </w:r>
           </w:p>
         </w:tc>
       </w:tr>
@@ -168,7 +157,6 @@
         <w:jc w:val="both"/>
         <w:rPr>
           <w:rFonts w:ascii="Arial" w:eastAsia="Arial" w:hAnsi="Arial" w:cs="Arial"/>
-          <w:color w:val="FF3333"/>
           <w:sz w:val="20"/>
           <w:szCs w:val="20"/>
         </w:rPr>
@@ -209,7 +197,6 @@
         <w:rPr>
           <w:rFonts w:ascii="Arial" w:eastAsia="Arial" w:hAnsi="Arial" w:cs="Arial"/>
           <w:b/>
-          <w:color w:val="525252" w:themeColor="accent3" w:themeShade="80"/>
           <w:sz w:val="20"/>
           <w:szCs w:val="20"/>
         </w:rPr>
@@ -218,7 +205,6 @@
         <w:rPr>
           <w:rFonts w:ascii="Arial" w:eastAsia="Arial" w:hAnsi="Arial" w:cs="Arial"/>
           <w:b/>
-          <w:color w:val="525252" w:themeColor="accent3" w:themeShade="80"/>
           <w:sz w:val="16"/>
           <w:szCs w:val="16"/>
         </w:rPr>
@@ -318,19 +304,17 @@
               <w:spacing w:after="0" w:line="240" w:lineRule="auto"/>
               <w:rPr>
                 <w:rFonts w:ascii="Arial" w:eastAsia="Arial" w:hAnsi="Arial" w:cs="Arial"/>
-                <w:color w:val="525252" w:themeColor="accent3" w:themeShade="80"/>
-                <w:sz w:val="20"/>
-                <w:szCs w:val="20"/>
-              </w:rPr>
-            </w:pPr>
-            <w:r>
-              <w:rPr>
-                <w:rFonts w:ascii="Arial" w:eastAsia="Arial" w:hAnsi="Arial" w:cs="Arial"/>
-                <w:color w:val="525252" w:themeColor="accent3" w:themeShade="80"/>
-                <w:sz w:val="20"/>
-                <w:szCs w:val="20"/>
-              </w:rPr>
-              <w:t>Preencher aqui</w:t>
+                <w:sz w:val="20"/>
+                <w:szCs w:val="20"/>
+              </w:rPr>
+            </w:pPr>
+            <w:r>
+              <w:rPr>
+                <w:rFonts w:ascii="Arial" w:eastAsia="Arial" w:hAnsi="Arial" w:cs="Arial"/>
+                <w:sz w:val="20"/>
+                <w:szCs w:val="20"/>
+              </w:rPr>
+              <w:t>Diogo Moreira Bomfim Bandeira</w:t>
             </w:r>
           </w:p>
           <w:p>
@@ -360,6 +344,15 @@
                 <w:szCs w:val="20"/>
               </w:rPr>
             </w:pPr>
+            <w:r>
+              <w:rPr>
+                <w:rFonts w:ascii="Arial" w:eastAsia="Arial" w:hAnsi="Arial" w:cs="Arial"/>
+                <w:b/>
+                <w:sz w:val="20"/>
+                <w:szCs w:val="20"/>
+              </w:rPr>
+              <w:t>24026300</w:t>
+            </w:r>
           </w:p>
         </w:tc>
       </w:tr>
@@ -374,11 +367,20 @@
               <w:spacing w:after="0" w:line="240" w:lineRule="auto"/>
               <w:rPr>
                 <w:rFonts w:ascii="Arial" w:eastAsia="Arial" w:hAnsi="Arial" w:cs="Arial"/>
-                <w:b/>
-                <w:sz w:val="20"/>
-                <w:szCs w:val="20"/>
-              </w:rPr>
-            </w:pPr>
+                <w:bCs/>
+                <w:sz w:val="20"/>
+                <w:szCs w:val="20"/>
+              </w:rPr>
+            </w:pPr>
+            <w:r>
+              <w:rPr>
+                <w:rFonts w:ascii="Arial" w:eastAsia="Arial" w:hAnsi="Arial" w:cs="Arial"/>
+                <w:bCs/>
+                <w:sz w:val="20"/>
+                <w:szCs w:val="20"/>
+              </w:rPr>
+              <w:t>Felipe de Castro e Lima</w:t>
+            </w:r>
           </w:p>
           <w:p>
             <w:pPr>
@@ -407,6 +409,15 @@
                 <w:szCs w:val="20"/>
               </w:rPr>
             </w:pPr>
+            <w:r>
+              <w:rPr>
+                <w:rFonts w:ascii="Arial" w:eastAsia="Arial" w:hAnsi="Arial" w:cs="Arial"/>
+                <w:b/>
+                <w:sz w:val="20"/>
+                <w:szCs w:val="20"/>
+              </w:rPr>
+              <w:t>24025867</w:t>
+            </w:r>
           </w:p>
         </w:tc>
       </w:tr>
@@ -421,11 +432,20 @@
               <w:spacing w:after="0" w:line="240" w:lineRule="auto"/>
               <w:rPr>
                 <w:rFonts w:ascii="Arial" w:eastAsia="Arial" w:hAnsi="Arial" w:cs="Arial"/>
-                <w:b/>
-                <w:sz w:val="20"/>
-                <w:szCs w:val="20"/>
-              </w:rPr>
-            </w:pPr>
+                <w:bCs/>
+                <w:sz w:val="20"/>
+                <w:szCs w:val="20"/>
+              </w:rPr>
+            </w:pPr>
+            <w:r>
+              <w:rPr>
+                <w:rFonts w:ascii="Arial" w:eastAsia="Arial" w:hAnsi="Arial" w:cs="Arial"/>
+                <w:bCs/>
+                <w:sz w:val="20"/>
+                <w:szCs w:val="20"/>
+              </w:rPr>
+              <w:t>João Vitor Cenedeze</w:t>
+            </w:r>
           </w:p>
           <w:p>
             <w:pPr>
@@ -454,6 +474,15 @@
                 <w:szCs w:val="20"/>
               </w:rPr>
             </w:pPr>
+            <w:r>
+              <w:rPr>
+                <w:rFonts w:ascii="Arial" w:eastAsia="Arial" w:hAnsi="Arial" w:cs="Arial"/>
+                <w:b/>
+                <w:sz w:val="20"/>
+                <w:szCs w:val="20"/>
+              </w:rPr>
+              <w:t>24025874</w:t>
+            </w:r>
           </w:p>
         </w:tc>
       </w:tr>
@@ -468,11 +497,20 @@
               <w:spacing w:after="0" w:line="240" w:lineRule="auto"/>
               <w:rPr>
                 <w:rFonts w:ascii="Arial" w:eastAsia="Arial" w:hAnsi="Arial" w:cs="Arial"/>
-                <w:b/>
-                <w:sz w:val="20"/>
-                <w:szCs w:val="20"/>
-              </w:rPr>
-            </w:pPr>
+                <w:bCs/>
+                <w:sz w:val="20"/>
+                <w:szCs w:val="20"/>
+              </w:rPr>
+            </w:pPr>
+            <w:r>
+              <w:rPr>
+                <w:rFonts w:ascii="Arial" w:eastAsia="Arial" w:hAnsi="Arial" w:cs="Arial"/>
+                <w:bCs/>
+                <w:sz w:val="20"/>
+                <w:szCs w:val="20"/>
+              </w:rPr>
+              <w:t>Lucas Oliveira Batista</w:t>
+            </w:r>
           </w:p>
           <w:p>
             <w:pPr>
@@ -501,6 +539,80 @@
                 <w:szCs w:val="20"/>
               </w:rPr>
             </w:pPr>
+            <w:r>
+              <w:rPr>
+                <w:rFonts w:ascii="Arial" w:eastAsia="Arial" w:hAnsi="Arial" w:cs="Arial"/>
+                <w:b/>
+                <w:sz w:val="20"/>
+                <w:szCs w:val="20"/>
+              </w:rPr>
+              <w:t>24025815</w:t>
+            </w:r>
+          </w:p>
+        </w:tc>
+      </w:tr>
+      <w:tr>
+        <w:tc>
+          <w:tcPr>
+            <w:tcW w:w="6675" w:type="dxa"/>
+            <w:shd w:val="clear" w:color="auto" w:fill="auto"/>
+          </w:tcPr>
+          <w:p>
+            <w:pPr>
+              <w:spacing w:after="0" w:line="240" w:lineRule="auto"/>
+              <w:rPr>
+                <w:rFonts w:ascii="Arial" w:eastAsia="Arial" w:hAnsi="Arial" w:cs="Arial"/>
+                <w:bCs/>
+                <w:sz w:val="20"/>
+                <w:szCs w:val="20"/>
+              </w:rPr>
+            </w:pPr>
+            <w:r>
+              <w:rPr>
+                <w:rFonts w:ascii="Arial" w:eastAsia="Arial" w:hAnsi="Arial" w:cs="Arial"/>
+                <w:bCs/>
+                <w:sz w:val="20"/>
+                <w:szCs w:val="20"/>
+              </w:rPr>
+              <w:t>Matheus Antero da Silva</w:t>
+            </w:r>
+          </w:p>
+          <w:p>
+            <w:pPr>
+              <w:spacing w:after="0" w:line="240" w:lineRule="auto"/>
+              <w:rPr>
+                <w:rFonts w:ascii="Arial" w:eastAsia="Arial" w:hAnsi="Arial" w:cs="Arial"/>
+                <w:bCs/>
+                <w:sz w:val="20"/>
+                <w:szCs w:val="20"/>
+              </w:rPr>
+            </w:pPr>
+          </w:p>
+        </w:tc>
+        <w:tc>
+          <w:tcPr>
+            <w:tcW w:w="2700" w:type="dxa"/>
+            <w:shd w:val="clear" w:color="auto" w:fill="auto"/>
+          </w:tcPr>
+          <w:p>
+            <w:pPr>
+              <w:spacing w:after="0" w:line="240" w:lineRule="auto"/>
+              <w:rPr>
+                <w:rFonts w:ascii="Arial" w:eastAsia="Arial" w:hAnsi="Arial" w:cs="Arial"/>
+                <w:b/>
+                <w:sz w:val="20"/>
+                <w:szCs w:val="20"/>
+              </w:rPr>
+            </w:pPr>
+            <w:r>
+              <w:rPr>
+                <w:rFonts w:ascii="Arial" w:eastAsia="Arial" w:hAnsi="Arial" w:cs="Arial"/>
+                <w:b/>
+                <w:sz w:val="20"/>
+                <w:szCs w:val="20"/>
+              </w:rPr>
+              <w:t>24026326</w:t>
+            </w:r>
           </w:p>
         </w:tc>
       </w:tr>
@@ -520,7 +632,6 @@
         <w:rPr>
           <w:rFonts w:ascii="Arial" w:eastAsia="Arial" w:hAnsi="Arial" w:cs="Arial"/>
           <w:b/>
-          <w:color w:val="000000"/>
           <w:sz w:val="20"/>
           <w:szCs w:val="20"/>
         </w:rPr>
@@ -540,7 +651,6 @@
         <w:rPr>
           <w:rFonts w:ascii="Arial" w:eastAsia="Arial" w:hAnsi="Arial" w:cs="Arial"/>
           <w:b/>
-          <w:color w:val="000000"/>
           <w:sz w:val="20"/>
           <w:szCs w:val="20"/>
         </w:rPr>
@@ -549,7 +659,6 @@
         <w:rPr>
           <w:rFonts w:ascii="Arial" w:eastAsia="Arial" w:hAnsi="Arial" w:cs="Arial"/>
           <w:b/>
-          <w:color w:val="000000"/>
           <w:sz w:val="20"/>
           <w:szCs w:val="20"/>
         </w:rPr>
@@ -592,29 +701,17 @@
               <w:rPr>
                 <w:rFonts w:ascii="Arial" w:eastAsia="Arial" w:hAnsi="Arial" w:cs="Arial"/>
                 <w:b/>
-                <w:color w:val="000000"/>
-                <w:sz w:val="20"/>
-                <w:szCs w:val="20"/>
-              </w:rPr>
-            </w:pPr>
-            <w:r>
-              <w:rPr>
-                <w:rFonts w:ascii="Arial" w:eastAsia="Arial" w:hAnsi="Arial" w:cs="Arial"/>
-                <w:color w:val="525252" w:themeColor="accent3" w:themeShade="80"/>
-                <w:sz w:val="20"/>
-                <w:szCs w:val="20"/>
-              </w:rPr>
-              <w:t>Inserir os dados neste espaço. Orientações: inserir o nome completo do professor responsável pela Atividade de Extensão.</w:t>
-            </w:r>
-            <w:r>
-              <w:rPr>
-                <w:rFonts w:ascii="Arial" w:eastAsia="Arial" w:hAnsi="Arial" w:cs="Arial"/>
-                <w:b/>
-                <w:color w:val="525252" w:themeColor="accent3" w:themeShade="80"/>
-                <w:sz w:val="16"/>
-                <w:szCs w:val="16"/>
-              </w:rPr>
-              <w:t xml:space="preserve"> </w:t>
+                <w:sz w:val="20"/>
+                <w:szCs w:val="20"/>
+              </w:rPr>
+            </w:pPr>
+            <w:r>
+              <w:rPr>
+                <w:rFonts w:ascii="Arial" w:eastAsia="Arial" w:hAnsi="Arial" w:cs="Arial"/>
+                <w:sz w:val="20"/>
+                <w:szCs w:val="20"/>
+              </w:rPr>
+              <w:t>Vinicius Heltai Pacheco</w:t>
             </w:r>
           </w:p>
         </w:tc>
@@ -634,7 +731,6 @@
         <w:rPr>
           <w:rFonts w:ascii="Arial" w:eastAsia="Arial" w:hAnsi="Arial" w:cs="Arial"/>
           <w:b/>
-          <w:color w:val="000000"/>
           <w:sz w:val="20"/>
           <w:szCs w:val="20"/>
         </w:rPr>
@@ -654,7 +750,6 @@
         <w:rPr>
           <w:rFonts w:ascii="Arial" w:eastAsia="Arial" w:hAnsi="Arial" w:cs="Arial"/>
           <w:b/>
-          <w:color w:val="000000"/>
           <w:sz w:val="20"/>
           <w:szCs w:val="20"/>
         </w:rPr>
@@ -663,7 +758,6 @@
         <w:rPr>
           <w:rFonts w:ascii="Arial" w:eastAsia="Arial" w:hAnsi="Arial" w:cs="Arial"/>
           <w:b/>
-          <w:color w:val="000000"/>
           <w:sz w:val="20"/>
           <w:szCs w:val="20"/>
         </w:rPr>
@@ -705,39 +799,19 @@
               <w:jc w:val="both"/>
               <w:rPr>
                 <w:rFonts w:ascii="Arial" w:eastAsia="Arial" w:hAnsi="Arial" w:cs="Arial"/>
-                <w:b/>
-                <w:color w:val="000000"/>
-                <w:sz w:val="20"/>
-                <w:szCs w:val="20"/>
-              </w:rPr>
-            </w:pPr>
-            <w:r>
-              <w:rPr>
-                <w:rFonts w:ascii="Arial" w:eastAsia="Arial" w:hAnsi="Arial" w:cs="Arial"/>
-                <w:color w:val="525252" w:themeColor="accent3" w:themeShade="80"/>
-                <w:sz w:val="20"/>
-                <w:szCs w:val="20"/>
-              </w:rPr>
-              <w:t>Inserir os dados neste espaço. Orientações:</w:t>
-            </w:r>
-            <w:r>
-              <w:rPr>
-                <w:rFonts w:ascii="Arial" w:eastAsia="Arial" w:hAnsi="Arial" w:cs="Arial"/>
-                <w:b/>
-                <w:color w:val="525252" w:themeColor="accent3" w:themeShade="80"/>
-                <w:sz w:val="16"/>
-                <w:szCs w:val="16"/>
-              </w:rPr>
-              <w:t xml:space="preserve"> </w:t>
-            </w:r>
-            <w:r>
-              <w:rPr>
-                <w:rFonts w:ascii="Arial" w:eastAsia="Arial" w:hAnsi="Arial" w:cs="Arial"/>
-                <w:color w:val="525252" w:themeColor="accent3" w:themeShade="80"/>
-                <w:sz w:val="20"/>
-                <w:szCs w:val="20"/>
-              </w:rPr>
-              <w:t>inserir o nome do curso de graduação.</w:t>
+                <w:bCs/>
+                <w:sz w:val="20"/>
+                <w:szCs w:val="20"/>
+              </w:rPr>
+            </w:pPr>
+            <w:r>
+              <w:rPr>
+                <w:rFonts w:ascii="Arial" w:eastAsia="Arial" w:hAnsi="Arial" w:cs="Arial"/>
+                <w:bCs/>
+                <w:sz w:val="20"/>
+                <w:szCs w:val="20"/>
+              </w:rPr>
+              <w:t>Análise e desenvolvimento de sistemas</w:t>
             </w:r>
           </w:p>
         </w:tc>
@@ -757,7 +831,6 @@
         <w:rPr>
           <w:rFonts w:ascii="Arial" w:eastAsia="Arial" w:hAnsi="Arial" w:cs="Arial"/>
           <w:b/>
-          <w:color w:val="000000"/>
           <w:sz w:val="20"/>
           <w:szCs w:val="20"/>
         </w:rPr>
@@ -791,7 +864,6 @@
         <w:rPr>
           <w:rFonts w:ascii="Arial" w:eastAsia="Arial" w:hAnsi="Arial" w:cs="Arial"/>
           <w:b/>
-          <w:color w:val="525252" w:themeColor="accent3" w:themeShade="80"/>
           <w:sz w:val="20"/>
           <w:szCs w:val="20"/>
         </w:rPr>
@@ -800,23 +872,18 @@
         <w:rPr>
           <w:rFonts w:ascii="Arial Unicode MS" w:eastAsia="Arial Unicode MS" w:hAnsi="Arial Unicode MS" w:cs="Arial Unicode MS"/>
           <w:b/>
-          <w:color w:val="525252" w:themeColor="accent3" w:themeShade="80"/>
           <w:sz w:val="16"/>
           <w:szCs w:val="16"/>
         </w:rPr>
         <w:t>Identificar com ✓ uma ou mais linhas de atuação conforme</w:t>
       </w:r>
       <w:r>
-        <w:rPr>
-          <w:color w:val="525252" w:themeColor="accent3" w:themeShade="80"/>
-        </w:rPr>
         <w:t xml:space="preserve"> </w:t>
       </w:r>
       <w:r>
         <w:rPr>
           <w:rFonts w:ascii="Arial" w:eastAsia="Arial" w:hAnsi="Arial" w:cs="Arial"/>
           <w:b/>
-          <w:color w:val="525252" w:themeColor="accent3" w:themeShade="80"/>
           <w:sz w:val="16"/>
           <w:szCs w:val="16"/>
         </w:rPr>
@@ -857,28 +924,17 @@
               <w:ind w:left="360"/>
               <w:rPr>
                 <w:rFonts w:ascii="Arial" w:eastAsia="Arial" w:hAnsi="Arial" w:cs="Arial"/>
-                <w:color w:val="000000"/>
-                <w:sz w:val="20"/>
-                <w:szCs w:val="20"/>
-              </w:rPr>
-            </w:pPr>
-            <w:r>
-              <w:rPr>
-                <w:rFonts w:ascii="Arial" w:eastAsia="Arial" w:hAnsi="Arial" w:cs="Arial"/>
-                <w:color w:val="000000"/>
-                <w:sz w:val="20"/>
-                <w:szCs w:val="20"/>
-              </w:rPr>
-              <w:t xml:space="preserve">- </w:t>
-            </w:r>
-            <w:r>
-              <w:rPr>
-                <w:rFonts w:ascii="Arial" w:eastAsia="Arial" w:hAnsi="Arial" w:cs="Arial"/>
-                <w:color w:val="000000"/>
-                <w:sz w:val="20"/>
-                <w:szCs w:val="20"/>
-              </w:rPr>
-              <w:t xml:space="preserve">Projeto Interdisciplinar: </w:t>
+                <w:sz w:val="20"/>
+                <w:szCs w:val="20"/>
+              </w:rPr>
+            </w:pPr>
+            <w:r>
+              <w:rPr>
+                <w:rFonts w:ascii="Arial" w:eastAsia="Arial" w:hAnsi="Arial" w:cs="Arial"/>
+                <w:sz w:val="20"/>
+                <w:szCs w:val="20"/>
+              </w:rPr>
+              <w:t xml:space="preserve">- Projeto Interdisciplinar: </w:t>
             </w:r>
           </w:p>
         </w:tc>
@@ -905,11 +961,18 @@
               <w:spacing w:after="0" w:line="240" w:lineRule="auto"/>
               <w:rPr>
                 <w:rFonts w:ascii="Arial" w:eastAsia="Arial" w:hAnsi="Arial" w:cs="Arial"/>
-                <w:color w:val="000000"/>
-                <w:sz w:val="20"/>
-                <w:szCs w:val="20"/>
-              </w:rPr>
-            </w:pPr>
+                <w:b/>
+              </w:rPr>
+            </w:pPr>
+            <w:r>
+              <w:rPr>
+                <w:rFonts w:ascii="Segoe UI Symbol" w:eastAsia="Arial Unicode MS" w:hAnsi="Segoe UI Symbol" w:cs="Segoe UI Symbol"/>
+                <w:b/>
+                <w:sz w:val="18"/>
+                <w:szCs w:val="18"/>
+              </w:rPr>
+              <w:t>✓</w:t>
+            </w:r>
           </w:p>
           <w:p>
             <w:pPr>
@@ -923,7 +986,6 @@
               <w:spacing w:after="0" w:line="240" w:lineRule="auto"/>
               <w:rPr>
                 <w:rFonts w:ascii="Arial" w:eastAsia="Arial" w:hAnsi="Arial" w:cs="Arial"/>
-                <w:color w:val="000000"/>
                 <w:sz w:val="20"/>
                 <w:szCs w:val="20"/>
               </w:rPr>
@@ -938,7 +1000,6 @@
         <w:jc w:val="both"/>
         <w:rPr>
           <w:rFonts w:ascii="Arial" w:eastAsia="Arial" w:hAnsi="Arial" w:cs="Arial"/>
-          <w:color w:val="FF3333"/>
           <w:sz w:val="20"/>
           <w:szCs w:val="20"/>
         </w:rPr>
@@ -972,7 +1033,6 @@
         <w:rPr>
           <w:rFonts w:ascii="Arial" w:eastAsia="Arial" w:hAnsi="Arial" w:cs="Arial"/>
           <w:b/>
-          <w:color w:val="525252" w:themeColor="accent3" w:themeShade="80"/>
           <w:sz w:val="16"/>
           <w:szCs w:val="16"/>
         </w:rPr>
@@ -981,7 +1041,6 @@
         <w:rPr>
           <w:rFonts w:ascii="Arial Unicode MS" w:eastAsia="Arial Unicode MS" w:hAnsi="Arial Unicode MS" w:cs="Arial Unicode MS"/>
           <w:b/>
-          <w:color w:val="525252" w:themeColor="accent3" w:themeShade="80"/>
           <w:sz w:val="16"/>
           <w:szCs w:val="16"/>
         </w:rPr>
@@ -1032,6 +1091,23 @@
                 <w:szCs w:val="20"/>
               </w:rPr>
               <w:t>Atividade de Extensão não implementado na prática (proposta de intervenção)</w:t>
+            </w:r>
+            <w:r>
+              <w:rPr>
+                <w:rFonts w:ascii="Arial" w:eastAsia="Arial" w:hAnsi="Arial" w:cs="Arial"/>
+                <w:sz w:val="20"/>
+                <w:szCs w:val="20"/>
+              </w:rPr>
+              <w:t xml:space="preserve"> </w:t>
+            </w:r>
+            <w:r>
+              <w:rPr>
+                <w:rFonts w:ascii="Segoe UI Symbol" w:eastAsia="Arial Unicode MS" w:hAnsi="Segoe UI Symbol" w:cs="Segoe UI Symbol"/>
+                <w:b/>
+                <w:sz w:val="18"/>
+                <w:szCs w:val="18"/>
+              </w:rPr>
+              <w:t>✓</w:t>
             </w:r>
           </w:p>
           <w:p>
@@ -1131,47 +1207,10 @@
             <w:r>
               <w:rPr>
                 <w:rFonts w:ascii="Arial" w:eastAsia="Arial" w:hAnsi="Arial" w:cs="Arial"/>
-                <w:color w:val="525252" w:themeColor="accent3" w:themeShade="80"/>
-                <w:sz w:val="20"/>
-                <w:szCs w:val="20"/>
-              </w:rPr>
-              <w:t xml:space="preserve">Estabelecido conforme </w:t>
-            </w:r>
-            <w:r>
-              <w:rPr>
-                <w:rFonts w:ascii="Arial" w:eastAsia="Arial" w:hAnsi="Arial" w:cs="Arial"/>
-                <w:color w:val="525252" w:themeColor="accent3" w:themeShade="80"/>
-                <w:sz w:val="20"/>
-                <w:szCs w:val="20"/>
-              </w:rPr>
-              <w:t>seleção da ODS e dos</w:t>
-            </w:r>
-            <w:r>
-              <w:rPr>
-                <w:rFonts w:ascii="Arial" w:eastAsia="Arial" w:hAnsi="Arial" w:cs="Arial"/>
-                <w:color w:val="525252" w:themeColor="accent3" w:themeShade="80"/>
-                <w:sz w:val="20"/>
-                <w:szCs w:val="20"/>
-              </w:rPr>
-              <w:t xml:space="preserve"> conhecimento</w:t>
-            </w:r>
-            <w:r>
-              <w:rPr>
-                <w:rFonts w:ascii="Arial" w:eastAsia="Arial" w:hAnsi="Arial" w:cs="Arial"/>
-                <w:color w:val="525252" w:themeColor="accent3" w:themeShade="80"/>
-                <w:sz w:val="20"/>
-                <w:szCs w:val="20"/>
-              </w:rPr>
-              <w:t>s a</w:t>
-            </w:r>
-            <w:r>
-              <w:rPr>
-                <w:rFonts w:ascii="Arial" w:eastAsia="Arial" w:hAnsi="Arial" w:cs="Arial"/>
-                <w:color w:val="525252" w:themeColor="accent3" w:themeShade="80"/>
-                <w:sz w:val="20"/>
-                <w:szCs w:val="20"/>
-              </w:rPr>
-              <w:t xml:space="preserve"> serem trabalhados e orientações do docente.</w:t>
+                <w:sz w:val="20"/>
+                <w:szCs w:val="20"/>
+              </w:rPr>
+              <w:t>Sistema gerenciamento de pagamentos acadêmicos (cantina, boletos, biblioteca,livraria…)</w:t>
             </w:r>
           </w:p>
         </w:tc>
@@ -1226,19 +1265,17 @@
               <w:shd w:val="clear" w:color="auto" w:fill="FFFFFF"/>
               <w:rPr>
                 <w:rFonts w:ascii="Arial" w:eastAsia="Arial" w:hAnsi="Arial" w:cs="Arial"/>
-                <w:color w:val="525252" w:themeColor="accent3" w:themeShade="80"/>
-                <w:sz w:val="20"/>
-                <w:szCs w:val="20"/>
-              </w:rPr>
-            </w:pPr>
-            <w:r>
-              <w:rPr>
-                <w:rFonts w:ascii="Arial" w:eastAsia="Arial" w:hAnsi="Arial" w:cs="Arial"/>
-                <w:color w:val="525252" w:themeColor="accent3" w:themeShade="80"/>
-                <w:sz w:val="20"/>
-                <w:szCs w:val="20"/>
-              </w:rPr>
-              <w:t xml:space="preserve">Inserir os dados neste espaço. </w:t>
+                <w:sz w:val="20"/>
+                <w:szCs w:val="20"/>
+              </w:rPr>
+            </w:pPr>
+            <w:r>
+              <w:rPr>
+                <w:rFonts w:ascii="Arial" w:eastAsia="Arial" w:hAnsi="Arial" w:cs="Arial"/>
+                <w:sz w:val="20"/>
+                <w:szCs w:val="20"/>
+              </w:rPr>
+              <w:t>O principal produto gerado foi o aplicativo Android FecapWallet, desenvolvido no Android Studio utilizando a linguagem Java. O app foi criado com foco na organização financeira de estudantes, permitindo o controle de despesas com cantina, boletos, biblioteca, livraria e outros serviços acadêmicos. O sistema também inclui cadastro e login de usuários, exibição de saldo em um cartão digital, extrato de transações e tela de perfil.</w:t>
             </w:r>
           </w:p>
           <w:p>
@@ -1246,58 +1283,942 @@
               <w:shd w:val="clear" w:color="auto" w:fill="FFFFFF"/>
               <w:rPr>
                 <w:rFonts w:ascii="Arial" w:eastAsia="Arial" w:hAnsi="Arial" w:cs="Arial"/>
-                <w:color w:val="525252" w:themeColor="accent3" w:themeShade="80"/>
-                <w:sz w:val="20"/>
-                <w:szCs w:val="20"/>
-              </w:rPr>
-            </w:pPr>
-            <w:r>
-              <w:rPr>
-                <w:rFonts w:ascii="Arial" w:eastAsia="Arial" w:hAnsi="Arial" w:cs="Arial"/>
-                <w:color w:val="525252" w:themeColor="accent3" w:themeShade="80"/>
-                <w:sz w:val="20"/>
-                <w:szCs w:val="20"/>
-              </w:rPr>
-              <w:t>Orientações:</w:t>
-            </w:r>
-            <w:r>
-              <w:rPr>
-                <w:rFonts w:ascii="Arial" w:eastAsia="Arial" w:hAnsi="Arial" w:cs="Arial"/>
-                <w:b/>
-                <w:color w:val="525252" w:themeColor="accent3" w:themeShade="80"/>
-                <w:sz w:val="16"/>
-                <w:szCs w:val="16"/>
+                <w:b/>
+                <w:sz w:val="20"/>
+                <w:szCs w:val="20"/>
+              </w:rPr>
+            </w:pPr>
+            <w:r>
+              <w:rPr>
+                <w:rFonts w:ascii="Arial" w:eastAsia="Arial" w:hAnsi="Arial" w:cs="Arial"/>
+                <w:b/>
+                <w:sz w:val="20"/>
+                <w:szCs w:val="20"/>
+              </w:rPr>
+              <w:lastRenderedPageBreak/>
+              <w:t>Código-fonte (GitHub):</w:t>
+            </w:r>
+            <w:r>
+              <w:rPr>
+                <w:rFonts w:ascii="Arial" w:eastAsia="Arial" w:hAnsi="Arial" w:cs="Arial"/>
+                <w:bCs/>
+                <w:sz w:val="20"/>
+                <w:szCs w:val="20"/>
               </w:rPr>
               <w:t xml:space="preserve"> </w:t>
             </w:r>
-            <w:r>
-              <w:rPr>
-                <w:rFonts w:ascii="Arial" w:eastAsia="Arial" w:hAnsi="Arial" w:cs="Arial"/>
-                <w:color w:val="525252" w:themeColor="accent3" w:themeShade="80"/>
-                <w:sz w:val="20"/>
-                <w:szCs w:val="20"/>
-              </w:rPr>
-              <w:t xml:space="preserve">Descrever o produto decorrente da atividade de Extensão. </w:t>
-            </w:r>
+            <w:hyperlink r:id="rId10" w:history="1">
+              <w:r>
+                <w:rPr>
+                  <w:rStyle w:val="Hiperligao"/>
+                  <w:rFonts w:ascii="Arial" w:eastAsia="Arial" w:hAnsi="Arial" w:cs="Arial"/>
+                  <w:bCs/>
+                  <w:color w:val="auto"/>
+                  <w:sz w:val="20"/>
+                  <w:szCs w:val="20"/>
+                </w:rPr>
+                <w:t>https://github.com/2025-1-NADS3/Projeto7</w:t>
+              </w:r>
+            </w:hyperlink>
           </w:p>
           <w:p>
             <w:pPr>
               <w:shd w:val="clear" w:color="auto" w:fill="FFFFFF"/>
               <w:rPr>
                 <w:rFonts w:ascii="Arial" w:eastAsia="Arial" w:hAnsi="Arial" w:cs="Arial"/>
-                <w:b/>
-                <w:sz w:val="20"/>
-                <w:szCs w:val="20"/>
-              </w:rPr>
-            </w:pPr>
-            <w:r>
-              <w:rPr>
-                <w:rFonts w:ascii="Arial" w:eastAsia="Arial" w:hAnsi="Arial" w:cs="Arial"/>
-                <w:color w:val="525252" w:themeColor="accent3" w:themeShade="80"/>
-                <w:sz w:val="20"/>
-                <w:szCs w:val="20"/>
-              </w:rPr>
-              <w:t>Apresentar evidências como fotos, links, folder, cartilha, código, apresentação, etc.</w:t>
+                <w:bCs/>
+                <w:sz w:val="20"/>
+                <w:szCs w:val="20"/>
+              </w:rPr>
+            </w:pPr>
+            <w:r>
+              <w:rPr>
+                <w:rFonts w:ascii="Arial" w:eastAsia="Arial" w:hAnsi="Arial" w:cs="Arial"/>
+                <w:b/>
+                <w:sz w:val="20"/>
+                <w:szCs w:val="20"/>
+              </w:rPr>
+              <w:t xml:space="preserve">Protótipo: </w:t>
+            </w:r>
+            <w:hyperlink r:id="rId11" w:history="1">
+              <w:r>
+                <w:rPr>
+                  <w:rStyle w:val="Hiperligao"/>
+                  <w:rFonts w:ascii="Arial" w:eastAsia="Arial" w:hAnsi="Arial" w:cs="Arial"/>
+                  <w:bCs/>
+                  <w:color w:val="auto"/>
+                  <w:sz w:val="20"/>
+                  <w:szCs w:val="20"/>
+                </w:rPr>
+                <w:t>https://www.figma.com/design/FFKh3OlISTtIARq5IODaed/Untitled?node-id=17-9432&amp;t=YXZHC96w7FNnNHUh-1</w:t>
+              </w:r>
+            </w:hyperlink>
+          </w:p>
+          <w:p>
+            <w:pPr>
+              <w:shd w:val="clear" w:color="auto" w:fill="FFFFFF"/>
+              <w:rPr>
+                <w:rFonts w:ascii="Arial" w:eastAsia="Arial" w:hAnsi="Arial" w:cs="Arial"/>
+                <w:bCs/>
+                <w:sz w:val="20"/>
+                <w:szCs w:val="20"/>
+              </w:rPr>
+            </w:pPr>
+            <w:r>
+              <w:rPr>
+                <w:rFonts w:ascii="Arial" w:eastAsia="Arial" w:hAnsi="Arial" w:cs="Arial"/>
+                <w:b/>
+                <w:sz w:val="20"/>
+                <w:szCs w:val="20"/>
+              </w:rPr>
+              <w:t xml:space="preserve">Video do aplicativo: </w:t>
+            </w:r>
+            <w:r>
+              <w:rPr>
+                <w:rFonts w:ascii="Arial" w:eastAsia="Arial" w:hAnsi="Arial" w:cs="Arial"/>
+                <w:bCs/>
+                <w:sz w:val="20"/>
+                <w:szCs w:val="20"/>
+              </w:rPr>
+              <w:t>https://drive.google.com/file/d/1pBXsc3AwloRKI1eLs1qY0dt2DgwAYYgG/view?usp=sharing</w:t>
+            </w:r>
+          </w:p>
+          <w:p>
+            <w:pPr>
+              <w:shd w:val="clear" w:color="auto" w:fill="FFFFFF"/>
+              <w:rPr>
+                <w:rFonts w:ascii="Arial" w:eastAsia="Arial" w:hAnsi="Arial" w:cs="Arial"/>
+                <w:b/>
+                <w:sz w:val="20"/>
+                <w:szCs w:val="20"/>
+              </w:rPr>
+            </w:pPr>
+            <w:r>
+              <w:rPr>
+                <w:rFonts w:ascii="Arial" w:eastAsia="Arial" w:hAnsi="Arial" w:cs="Arial"/>
+                <w:b/>
+                <w:sz w:val="20"/>
+                <w:szCs w:val="20"/>
+              </w:rPr>
+              <w:t>Imagens do aplicativo:</w:t>
+            </w:r>
+            <w:r>
+              <w:rPr>
+                <w:rFonts w:ascii="Arial" w:eastAsia="Arial" w:hAnsi="Arial" w:cs="Arial"/>
+                <w:b/>
+                <w:sz w:val="20"/>
+                <w:szCs w:val="20"/>
+              </w:rPr>
+              <w:t xml:space="preserve"> </w:t>
+            </w:r>
+          </w:p>
+          <w:p>
+            <w:pPr>
+              <w:shd w:val="clear" w:color="auto" w:fill="FFFFFF"/>
+              <w:rPr>
+                <w:rFonts w:ascii="Arial" w:eastAsia="Arial" w:hAnsi="Arial" w:cs="Arial"/>
+                <w:b/>
+                <w:sz w:val="20"/>
+                <w:szCs w:val="20"/>
+              </w:rPr>
+            </w:pPr>
+            <w:r>
+              <w:rPr>
+                <w:rFonts w:ascii="Arial" w:eastAsia="Arial" w:hAnsi="Arial" w:cs="Arial"/>
+                <w:b/>
+                <w:noProof/>
+                <w:sz w:val="20"/>
+                <w:szCs w:val="20"/>
+              </w:rPr>
+              <w:drawing>
+                <wp:inline distT="0" distB="0" distL="0" distR="0" wp14:anchorId="583B2B8C" wp14:editId="3F4C1934">
+                  <wp:extent cx="824346" cy="1830777"/>
+                  <wp:effectExtent l="0" t="0" r="0" b="0"/>
+                  <wp:docPr id="1028358320" name="Imagem 18"/>
+                  <wp:cNvGraphicFramePr>
+                    <a:graphicFrameLocks xmlns:a="http://schemas.openxmlformats.org/drawingml/2006/main" noChangeAspect="1"/>
+                  </wp:cNvGraphicFramePr>
+                  <a:graphic xmlns:a="http://schemas.openxmlformats.org/drawingml/2006/main">
+                    <a:graphicData uri="http://schemas.openxmlformats.org/drawingml/2006/picture">
+                      <pic:pic xmlns:pic="http://schemas.openxmlformats.org/drawingml/2006/picture">
+                        <pic:nvPicPr>
+                          <pic:cNvPr id="0" name="Picture 18"/>
+                          <pic:cNvPicPr>
+                            <a:picLocks noChangeAspect="1" noChangeArrowheads="1"/>
+                          </pic:cNvPicPr>
+                        </pic:nvPicPr>
+                        <pic:blipFill>
+                          <a:blip r:embed="rId12" cstate="print">
+                            <a:extLst>
+                              <a:ext uri="{28A0092B-C50C-407E-A947-70E740481C1C}">
+                                <a14:useLocalDpi xmlns:a14="http://schemas.microsoft.com/office/drawing/2010/main" val="0"/>
+                              </a:ext>
+                            </a:extLst>
+                          </a:blip>
+                          <a:srcRect/>
+                          <a:stretch>
+                            <a:fillRect/>
+                          </a:stretch>
+                        </pic:blipFill>
+                        <pic:spPr bwMode="auto">
+                          <a:xfrm>
+                            <a:off x="0" y="0"/>
+                            <a:ext cx="872942" cy="1938703"/>
+                          </a:xfrm>
+                          <a:prstGeom prst="rect">
+                            <a:avLst/>
+                          </a:prstGeom>
+                          <a:noFill/>
+                          <a:ln>
+                            <a:noFill/>
+                          </a:ln>
+                        </pic:spPr>
+                      </pic:pic>
+                    </a:graphicData>
+                  </a:graphic>
+                </wp:inline>
+              </w:drawing>
+            </w:r>
+            <w:r>
+              <w:rPr>
+                <w:rFonts w:ascii="Arial" w:eastAsia="Arial" w:hAnsi="Arial" w:cs="Arial"/>
+                <w:b/>
+                <w:noProof/>
+                <w:sz w:val="20"/>
+                <w:szCs w:val="20"/>
+              </w:rPr>
+              <w:drawing>
+                <wp:inline distT="0" distB="0" distL="0" distR="0" wp14:anchorId="333104A8" wp14:editId="39D519D0">
+                  <wp:extent cx="824346" cy="1821803"/>
+                  <wp:effectExtent l="0" t="0" r="0" b="7620"/>
+                  <wp:docPr id="188573298" name="Imagem 25"/>
+                  <wp:cNvGraphicFramePr>
+                    <a:graphicFrameLocks xmlns:a="http://schemas.openxmlformats.org/drawingml/2006/main" noChangeAspect="1"/>
+                  </wp:cNvGraphicFramePr>
+                  <a:graphic xmlns:a="http://schemas.openxmlformats.org/drawingml/2006/main">
+                    <a:graphicData uri="http://schemas.openxmlformats.org/drawingml/2006/picture">
+                      <pic:pic xmlns:pic="http://schemas.openxmlformats.org/drawingml/2006/picture">
+                        <pic:nvPicPr>
+                          <pic:cNvPr id="0" name="Picture 25"/>
+                          <pic:cNvPicPr>
+                            <a:picLocks noChangeAspect="1" noChangeArrowheads="1"/>
+                          </pic:cNvPicPr>
+                        </pic:nvPicPr>
+                        <pic:blipFill>
+                          <a:blip r:embed="rId13" cstate="print">
+                            <a:extLst>
+                              <a:ext uri="{28A0092B-C50C-407E-A947-70E740481C1C}">
+                                <a14:useLocalDpi xmlns:a14="http://schemas.microsoft.com/office/drawing/2010/main" val="0"/>
+                              </a:ext>
+                            </a:extLst>
+                          </a:blip>
+                          <a:srcRect/>
+                          <a:stretch>
+                            <a:fillRect/>
+                          </a:stretch>
+                        </pic:blipFill>
+                        <pic:spPr bwMode="auto">
+                          <a:xfrm>
+                            <a:off x="0" y="0"/>
+                            <a:ext cx="857425" cy="1894908"/>
+                          </a:xfrm>
+                          <a:prstGeom prst="rect">
+                            <a:avLst/>
+                          </a:prstGeom>
+                          <a:noFill/>
+                          <a:ln>
+                            <a:noFill/>
+                          </a:ln>
+                        </pic:spPr>
+                      </pic:pic>
+                    </a:graphicData>
+                  </a:graphic>
+                </wp:inline>
+              </w:drawing>
+            </w:r>
+            <w:r>
+              <w:rPr>
+                <w:rFonts w:ascii="Arial" w:eastAsia="Arial" w:hAnsi="Arial" w:cs="Arial"/>
+                <w:b/>
+                <w:noProof/>
+                <w:sz w:val="20"/>
+                <w:szCs w:val="20"/>
+              </w:rPr>
+              <w:drawing>
+                <wp:inline distT="0" distB="0" distL="0" distR="0" wp14:anchorId="5570C846" wp14:editId="0FF4B51F">
+                  <wp:extent cx="821266" cy="1826578"/>
+                  <wp:effectExtent l="0" t="0" r="0" b="2540"/>
+                  <wp:docPr id="2003115445" name="Imagem 21"/>
+                  <wp:cNvGraphicFramePr>
+                    <a:graphicFrameLocks xmlns:a="http://schemas.openxmlformats.org/drawingml/2006/main" noChangeAspect="1"/>
+                  </wp:cNvGraphicFramePr>
+                  <a:graphic xmlns:a="http://schemas.openxmlformats.org/drawingml/2006/main">
+                    <a:graphicData uri="http://schemas.openxmlformats.org/drawingml/2006/picture">
+                      <pic:pic xmlns:pic="http://schemas.openxmlformats.org/drawingml/2006/picture">
+                        <pic:nvPicPr>
+                          <pic:cNvPr id="0" name="Picture 21"/>
+                          <pic:cNvPicPr>
+                            <a:picLocks noChangeAspect="1" noChangeArrowheads="1"/>
+                          </pic:cNvPicPr>
+                        </pic:nvPicPr>
+                        <pic:blipFill>
+                          <a:blip r:embed="rId14" cstate="print">
+                            <a:extLst>
+                              <a:ext uri="{28A0092B-C50C-407E-A947-70E740481C1C}">
+                                <a14:useLocalDpi xmlns:a14="http://schemas.microsoft.com/office/drawing/2010/main" val="0"/>
+                              </a:ext>
+                            </a:extLst>
+                          </a:blip>
+                          <a:srcRect/>
+                          <a:stretch>
+                            <a:fillRect/>
+                          </a:stretch>
+                        </pic:blipFill>
+                        <pic:spPr bwMode="auto">
+                          <a:xfrm>
+                            <a:off x="0" y="0"/>
+                            <a:ext cx="854928" cy="1901445"/>
+                          </a:xfrm>
+                          <a:prstGeom prst="rect">
+                            <a:avLst/>
+                          </a:prstGeom>
+                          <a:noFill/>
+                          <a:ln>
+                            <a:noFill/>
+                          </a:ln>
+                        </pic:spPr>
+                      </pic:pic>
+                    </a:graphicData>
+                  </a:graphic>
+                </wp:inline>
+              </w:drawing>
+            </w:r>
+            <w:r>
+              <w:rPr>
+                <w:rFonts w:ascii="Arial" w:eastAsia="Arial" w:hAnsi="Arial" w:cs="Arial"/>
+                <w:b/>
+                <w:noProof/>
+                <w:sz w:val="20"/>
+                <w:szCs w:val="20"/>
+              </w:rPr>
+              <w:drawing>
+                <wp:inline distT="0" distB="0" distL="0" distR="0" wp14:anchorId="1A0895AF" wp14:editId="649DACA2">
+                  <wp:extent cx="821267" cy="1826581"/>
+                  <wp:effectExtent l="0" t="0" r="0" b="2540"/>
+                  <wp:docPr id="1967815105" name="Imagem 19"/>
+                  <wp:cNvGraphicFramePr>
+                    <a:graphicFrameLocks xmlns:a="http://schemas.openxmlformats.org/drawingml/2006/main" noChangeAspect="1"/>
+                  </wp:cNvGraphicFramePr>
+                  <a:graphic xmlns:a="http://schemas.openxmlformats.org/drawingml/2006/main">
+                    <a:graphicData uri="http://schemas.openxmlformats.org/drawingml/2006/picture">
+                      <pic:pic xmlns:pic="http://schemas.openxmlformats.org/drawingml/2006/picture">
+                        <pic:nvPicPr>
+                          <pic:cNvPr id="0" name="Picture 19"/>
+                          <pic:cNvPicPr>
+                            <a:picLocks noChangeAspect="1" noChangeArrowheads="1"/>
+                          </pic:cNvPicPr>
+                        </pic:nvPicPr>
+                        <pic:blipFill>
+                          <a:blip r:embed="rId15" cstate="print">
+                            <a:extLst>
+                              <a:ext uri="{28A0092B-C50C-407E-A947-70E740481C1C}">
+                                <a14:useLocalDpi xmlns:a14="http://schemas.microsoft.com/office/drawing/2010/main" val="0"/>
+                              </a:ext>
+                            </a:extLst>
+                          </a:blip>
+                          <a:srcRect/>
+                          <a:stretch>
+                            <a:fillRect/>
+                          </a:stretch>
+                        </pic:blipFill>
+                        <pic:spPr bwMode="auto">
+                          <a:xfrm>
+                            <a:off x="0" y="0"/>
+                            <a:ext cx="854069" cy="1899537"/>
+                          </a:xfrm>
+                          <a:prstGeom prst="rect">
+                            <a:avLst/>
+                          </a:prstGeom>
+                          <a:noFill/>
+                          <a:ln>
+                            <a:noFill/>
+                          </a:ln>
+                        </pic:spPr>
+                      </pic:pic>
+                    </a:graphicData>
+                  </a:graphic>
+                </wp:inline>
+              </w:drawing>
+            </w:r>
+            <w:r>
+              <w:rPr>
+                <w:rFonts w:ascii="Arial" w:eastAsia="Arial" w:hAnsi="Arial" w:cs="Arial"/>
+                <w:b/>
+                <w:noProof/>
+                <w:sz w:val="20"/>
+                <w:szCs w:val="20"/>
+              </w:rPr>
+              <w:drawing>
+                <wp:inline distT="0" distB="0" distL="0" distR="0" wp14:anchorId="40D61A68" wp14:editId="4342615B">
+                  <wp:extent cx="821267" cy="1826182"/>
+                  <wp:effectExtent l="0" t="0" r="0" b="3175"/>
+                  <wp:docPr id="1096359870" name="Imagem 26"/>
+                  <wp:cNvGraphicFramePr>
+                    <a:graphicFrameLocks xmlns:a="http://schemas.openxmlformats.org/drawingml/2006/main" noChangeAspect="1"/>
+                  </wp:cNvGraphicFramePr>
+                  <a:graphic xmlns:a="http://schemas.openxmlformats.org/drawingml/2006/main">
+                    <a:graphicData uri="http://schemas.openxmlformats.org/drawingml/2006/picture">
+                      <pic:pic xmlns:pic="http://schemas.openxmlformats.org/drawingml/2006/picture">
+                        <pic:nvPicPr>
+                          <pic:cNvPr id="0" name="Picture 26"/>
+                          <pic:cNvPicPr>
+                            <a:picLocks noChangeAspect="1" noChangeArrowheads="1"/>
+                          </pic:cNvPicPr>
+                        </pic:nvPicPr>
+                        <pic:blipFill>
+                          <a:blip r:embed="rId16" cstate="print">
+                            <a:extLst>
+                              <a:ext uri="{28A0092B-C50C-407E-A947-70E740481C1C}">
+                                <a14:useLocalDpi xmlns:a14="http://schemas.microsoft.com/office/drawing/2010/main" val="0"/>
+                              </a:ext>
+                            </a:extLst>
+                          </a:blip>
+                          <a:srcRect/>
+                          <a:stretch>
+                            <a:fillRect/>
+                          </a:stretch>
+                        </pic:blipFill>
+                        <pic:spPr bwMode="auto">
+                          <a:xfrm>
+                            <a:off x="0" y="0"/>
+                            <a:ext cx="836806" cy="1860735"/>
+                          </a:xfrm>
+                          <a:prstGeom prst="rect">
+                            <a:avLst/>
+                          </a:prstGeom>
+                          <a:noFill/>
+                          <a:ln>
+                            <a:noFill/>
+                          </a:ln>
+                        </pic:spPr>
+                      </pic:pic>
+                    </a:graphicData>
+                  </a:graphic>
+                </wp:inline>
+              </w:drawing>
+            </w:r>
+            <w:r>
+              <w:rPr>
+                <w:rFonts w:ascii="Arial" w:eastAsia="Arial" w:hAnsi="Arial" w:cs="Arial"/>
+                <w:b/>
+                <w:noProof/>
+                <w:sz w:val="20"/>
+                <w:szCs w:val="20"/>
+              </w:rPr>
+              <w:drawing>
+                <wp:inline distT="0" distB="0" distL="0" distR="0" wp14:anchorId="72ED7576" wp14:editId="18913DD3">
+                  <wp:extent cx="821266" cy="1826182"/>
+                  <wp:effectExtent l="0" t="0" r="0" b="3175"/>
+                  <wp:docPr id="1663384376" name="Imagem 28"/>
+                  <wp:cNvGraphicFramePr>
+                    <a:graphicFrameLocks xmlns:a="http://schemas.openxmlformats.org/drawingml/2006/main" noChangeAspect="1"/>
+                  </wp:cNvGraphicFramePr>
+                  <a:graphic xmlns:a="http://schemas.openxmlformats.org/drawingml/2006/main">
+                    <a:graphicData uri="http://schemas.openxmlformats.org/drawingml/2006/picture">
+                      <pic:pic xmlns:pic="http://schemas.openxmlformats.org/drawingml/2006/picture">
+                        <pic:nvPicPr>
+                          <pic:cNvPr id="0" name="Picture 28"/>
+                          <pic:cNvPicPr>
+                            <a:picLocks noChangeAspect="1" noChangeArrowheads="1"/>
+                          </pic:cNvPicPr>
+                        </pic:nvPicPr>
+                        <pic:blipFill>
+                          <a:blip r:embed="rId17" cstate="print">
+                            <a:extLst>
+                              <a:ext uri="{28A0092B-C50C-407E-A947-70E740481C1C}">
+                                <a14:useLocalDpi xmlns:a14="http://schemas.microsoft.com/office/drawing/2010/main" val="0"/>
+                              </a:ext>
+                            </a:extLst>
+                          </a:blip>
+                          <a:srcRect/>
+                          <a:stretch>
+                            <a:fillRect/>
+                          </a:stretch>
+                        </pic:blipFill>
+                        <pic:spPr bwMode="auto">
+                          <a:xfrm>
+                            <a:off x="0" y="0"/>
+                            <a:ext cx="837347" cy="1861940"/>
+                          </a:xfrm>
+                          <a:prstGeom prst="rect">
+                            <a:avLst/>
+                          </a:prstGeom>
+                          <a:noFill/>
+                          <a:ln>
+                            <a:noFill/>
+                          </a:ln>
+                        </pic:spPr>
+                      </pic:pic>
+                    </a:graphicData>
+                  </a:graphic>
+                </wp:inline>
+              </w:drawing>
+            </w:r>
+            <w:r>
+              <w:rPr>
+                <w:rFonts w:ascii="Arial" w:eastAsia="Arial" w:hAnsi="Arial" w:cs="Arial"/>
+                <w:b/>
+                <w:noProof/>
+                <w:sz w:val="20"/>
+                <w:szCs w:val="20"/>
+              </w:rPr>
+              <w:drawing>
+                <wp:inline distT="0" distB="0" distL="0" distR="0" wp14:anchorId="0CB5D4AB" wp14:editId="11BAA9FA">
+                  <wp:extent cx="825500" cy="1835596"/>
+                  <wp:effectExtent l="0" t="0" r="0" b="0"/>
+                  <wp:docPr id="284661866" name="Imagem 29"/>
+                  <wp:cNvGraphicFramePr>
+                    <a:graphicFrameLocks xmlns:a="http://schemas.openxmlformats.org/drawingml/2006/main" noChangeAspect="1"/>
+                  </wp:cNvGraphicFramePr>
+                  <a:graphic xmlns:a="http://schemas.openxmlformats.org/drawingml/2006/main">
+                    <a:graphicData uri="http://schemas.openxmlformats.org/drawingml/2006/picture">
+                      <pic:pic xmlns:pic="http://schemas.openxmlformats.org/drawingml/2006/picture">
+                        <pic:nvPicPr>
+                          <pic:cNvPr id="0" name="Picture 29"/>
+                          <pic:cNvPicPr>
+                            <a:picLocks noChangeAspect="1" noChangeArrowheads="1"/>
+                          </pic:cNvPicPr>
+                        </pic:nvPicPr>
+                        <pic:blipFill>
+                          <a:blip r:embed="rId18" cstate="print">
+                            <a:extLst>
+                              <a:ext uri="{28A0092B-C50C-407E-A947-70E740481C1C}">
+                                <a14:useLocalDpi xmlns:a14="http://schemas.microsoft.com/office/drawing/2010/main" val="0"/>
+                              </a:ext>
+                            </a:extLst>
+                          </a:blip>
+                          <a:srcRect/>
+                          <a:stretch>
+                            <a:fillRect/>
+                          </a:stretch>
+                        </pic:blipFill>
+                        <pic:spPr bwMode="auto">
+                          <a:xfrm>
+                            <a:off x="0" y="0"/>
+                            <a:ext cx="864606" cy="1922553"/>
+                          </a:xfrm>
+                          <a:prstGeom prst="rect">
+                            <a:avLst/>
+                          </a:prstGeom>
+                          <a:noFill/>
+                          <a:ln>
+                            <a:noFill/>
+                          </a:ln>
+                        </pic:spPr>
+                      </pic:pic>
+                    </a:graphicData>
+                  </a:graphic>
+                </wp:inline>
+              </w:drawing>
+            </w:r>
+            <w:r>
+              <w:rPr>
+                <w:rFonts w:ascii="Arial" w:eastAsia="Arial" w:hAnsi="Arial" w:cs="Arial"/>
+                <w:b/>
+                <w:noProof/>
+                <w:sz w:val="20"/>
+                <w:szCs w:val="20"/>
+              </w:rPr>
+              <w:drawing>
+                <wp:inline distT="0" distB="0" distL="0" distR="0" wp14:anchorId="78116B35" wp14:editId="66136947">
+                  <wp:extent cx="821266" cy="1826180"/>
+                  <wp:effectExtent l="0" t="0" r="0" b="3175"/>
+                  <wp:docPr id="1199890652" name="Imagem 27"/>
+                  <wp:cNvGraphicFramePr>
+                    <a:graphicFrameLocks xmlns:a="http://schemas.openxmlformats.org/drawingml/2006/main" noChangeAspect="1"/>
+                  </wp:cNvGraphicFramePr>
+                  <a:graphic xmlns:a="http://schemas.openxmlformats.org/drawingml/2006/main">
+                    <a:graphicData uri="http://schemas.openxmlformats.org/drawingml/2006/picture">
+                      <pic:pic xmlns:pic="http://schemas.openxmlformats.org/drawingml/2006/picture">
+                        <pic:nvPicPr>
+                          <pic:cNvPr id="0" name="Picture 27"/>
+                          <pic:cNvPicPr>
+                            <a:picLocks noChangeAspect="1" noChangeArrowheads="1"/>
+                          </pic:cNvPicPr>
+                        </pic:nvPicPr>
+                        <pic:blipFill>
+                          <a:blip r:embed="rId19" cstate="print">
+                            <a:extLst>
+                              <a:ext uri="{28A0092B-C50C-407E-A947-70E740481C1C}">
+                                <a14:useLocalDpi xmlns:a14="http://schemas.microsoft.com/office/drawing/2010/main" val="0"/>
+                              </a:ext>
+                            </a:extLst>
+                          </a:blip>
+                          <a:srcRect/>
+                          <a:stretch>
+                            <a:fillRect/>
+                          </a:stretch>
+                        </pic:blipFill>
+                        <pic:spPr bwMode="auto">
+                          <a:xfrm>
+                            <a:off x="0" y="0"/>
+                            <a:ext cx="851726" cy="1893912"/>
+                          </a:xfrm>
+                          <a:prstGeom prst="rect">
+                            <a:avLst/>
+                          </a:prstGeom>
+                          <a:noFill/>
+                          <a:ln>
+                            <a:noFill/>
+                          </a:ln>
+                        </pic:spPr>
+                      </pic:pic>
+                    </a:graphicData>
+                  </a:graphic>
+                </wp:inline>
+              </w:drawing>
+            </w:r>
+            <w:r>
+              <w:rPr>
+                <w:rFonts w:ascii="Arial" w:eastAsia="Arial" w:hAnsi="Arial" w:cs="Arial"/>
+                <w:b/>
+                <w:noProof/>
+                <w:sz w:val="20"/>
+                <w:szCs w:val="20"/>
+              </w:rPr>
+              <w:drawing>
+                <wp:inline distT="0" distB="0" distL="0" distR="0" wp14:anchorId="3A02EE2E" wp14:editId="4774C76D">
+                  <wp:extent cx="842433" cy="1873250"/>
+                  <wp:effectExtent l="0" t="0" r="0" b="0"/>
+                  <wp:docPr id="832388724" name="Imagem 36"/>
+                  <wp:cNvGraphicFramePr>
+                    <a:graphicFrameLocks xmlns:a="http://schemas.openxmlformats.org/drawingml/2006/main" noChangeAspect="1"/>
+                  </wp:cNvGraphicFramePr>
+                  <a:graphic xmlns:a="http://schemas.openxmlformats.org/drawingml/2006/main">
+                    <a:graphicData uri="http://schemas.openxmlformats.org/drawingml/2006/picture">
+                      <pic:pic xmlns:pic="http://schemas.openxmlformats.org/drawingml/2006/picture">
+                        <pic:nvPicPr>
+                          <pic:cNvPr id="0" name="Picture 36"/>
+                          <pic:cNvPicPr>
+                            <a:picLocks noChangeAspect="1" noChangeArrowheads="1"/>
+                          </pic:cNvPicPr>
+                        </pic:nvPicPr>
+                        <pic:blipFill>
+                          <a:blip r:embed="rId20" cstate="print">
+                            <a:extLst>
+                              <a:ext uri="{28A0092B-C50C-407E-A947-70E740481C1C}">
+                                <a14:useLocalDpi xmlns:a14="http://schemas.microsoft.com/office/drawing/2010/main" val="0"/>
+                              </a:ext>
+                            </a:extLst>
+                          </a:blip>
+                          <a:srcRect/>
+                          <a:stretch>
+                            <a:fillRect/>
+                          </a:stretch>
+                        </pic:blipFill>
+                        <pic:spPr bwMode="auto">
+                          <a:xfrm>
+                            <a:off x="0" y="0"/>
+                            <a:ext cx="864692" cy="1922746"/>
+                          </a:xfrm>
+                          <a:prstGeom prst="rect">
+                            <a:avLst/>
+                          </a:prstGeom>
+                          <a:noFill/>
+                          <a:ln>
+                            <a:noFill/>
+                          </a:ln>
+                        </pic:spPr>
+                      </pic:pic>
+                    </a:graphicData>
+                  </a:graphic>
+                </wp:inline>
+              </w:drawing>
+            </w:r>
+            <w:r>
+              <w:rPr>
+                <w:rFonts w:ascii="Arial" w:eastAsia="Arial" w:hAnsi="Arial" w:cs="Arial"/>
+                <w:b/>
+                <w:noProof/>
+                <w:sz w:val="20"/>
+                <w:szCs w:val="20"/>
+              </w:rPr>
+              <w:drawing>
+                <wp:inline distT="0" distB="0" distL="0" distR="0" wp14:anchorId="1323BDFC" wp14:editId="2EBDEE89">
+                  <wp:extent cx="842433" cy="1873250"/>
+                  <wp:effectExtent l="0" t="0" r="0" b="0"/>
+                  <wp:docPr id="1675385727" name="Imagem 37"/>
+                  <wp:cNvGraphicFramePr>
+                    <a:graphicFrameLocks xmlns:a="http://schemas.openxmlformats.org/drawingml/2006/main" noChangeAspect="1"/>
+                  </wp:cNvGraphicFramePr>
+                  <a:graphic xmlns:a="http://schemas.openxmlformats.org/drawingml/2006/main">
+                    <a:graphicData uri="http://schemas.openxmlformats.org/drawingml/2006/picture">
+                      <pic:pic xmlns:pic="http://schemas.openxmlformats.org/drawingml/2006/picture">
+                        <pic:nvPicPr>
+                          <pic:cNvPr id="0" name="Picture 37"/>
+                          <pic:cNvPicPr>
+                            <a:picLocks noChangeAspect="1" noChangeArrowheads="1"/>
+                          </pic:cNvPicPr>
+                        </pic:nvPicPr>
+                        <pic:blipFill>
+                          <a:blip r:embed="rId21" cstate="print">
+                            <a:extLst>
+                              <a:ext uri="{28A0092B-C50C-407E-A947-70E740481C1C}">
+                                <a14:useLocalDpi xmlns:a14="http://schemas.microsoft.com/office/drawing/2010/main" val="0"/>
+                              </a:ext>
+                            </a:extLst>
+                          </a:blip>
+                          <a:srcRect/>
+                          <a:stretch>
+                            <a:fillRect/>
+                          </a:stretch>
+                        </pic:blipFill>
+                        <pic:spPr bwMode="auto">
+                          <a:xfrm>
+                            <a:off x="0" y="0"/>
+                            <a:ext cx="864599" cy="1922539"/>
+                          </a:xfrm>
+                          <a:prstGeom prst="rect">
+                            <a:avLst/>
+                          </a:prstGeom>
+                          <a:noFill/>
+                          <a:ln>
+                            <a:noFill/>
+                          </a:ln>
+                        </pic:spPr>
+                      </pic:pic>
+                    </a:graphicData>
+                  </a:graphic>
+                </wp:inline>
+              </w:drawing>
+            </w:r>
+            <w:r>
+              <w:rPr>
+                <w:rFonts w:ascii="Arial" w:eastAsia="Arial" w:hAnsi="Arial" w:cs="Arial"/>
+                <w:b/>
+                <w:noProof/>
+                <w:sz w:val="20"/>
+                <w:szCs w:val="20"/>
+              </w:rPr>
+              <w:drawing>
+                <wp:inline distT="0" distB="0" distL="0" distR="0" wp14:anchorId="62ED3134" wp14:editId="6B40C477">
+                  <wp:extent cx="842433" cy="1873250"/>
+                  <wp:effectExtent l="0" t="0" r="0" b="0"/>
+                  <wp:docPr id="405498031" name="Imagem 38"/>
+                  <wp:cNvGraphicFramePr>
+                    <a:graphicFrameLocks xmlns:a="http://schemas.openxmlformats.org/drawingml/2006/main" noChangeAspect="1"/>
+                  </wp:cNvGraphicFramePr>
+                  <a:graphic xmlns:a="http://schemas.openxmlformats.org/drawingml/2006/main">
+                    <a:graphicData uri="http://schemas.openxmlformats.org/drawingml/2006/picture">
+                      <pic:pic xmlns:pic="http://schemas.openxmlformats.org/drawingml/2006/picture">
+                        <pic:nvPicPr>
+                          <pic:cNvPr id="0" name="Picture 38"/>
+                          <pic:cNvPicPr>
+                            <a:picLocks noChangeAspect="1" noChangeArrowheads="1"/>
+                          </pic:cNvPicPr>
+                        </pic:nvPicPr>
+                        <pic:blipFill>
+                          <a:blip r:embed="rId22" cstate="print">
+                            <a:extLst>
+                              <a:ext uri="{28A0092B-C50C-407E-A947-70E740481C1C}">
+                                <a14:useLocalDpi xmlns:a14="http://schemas.microsoft.com/office/drawing/2010/main" val="0"/>
+                              </a:ext>
+                            </a:extLst>
+                          </a:blip>
+                          <a:srcRect/>
+                          <a:stretch>
+                            <a:fillRect/>
+                          </a:stretch>
+                        </pic:blipFill>
+                        <pic:spPr bwMode="auto">
+                          <a:xfrm>
+                            <a:off x="0" y="0"/>
+                            <a:ext cx="863461" cy="1920007"/>
+                          </a:xfrm>
+                          <a:prstGeom prst="rect">
+                            <a:avLst/>
+                          </a:prstGeom>
+                          <a:noFill/>
+                          <a:ln>
+                            <a:noFill/>
+                          </a:ln>
+                        </pic:spPr>
+                      </pic:pic>
+                    </a:graphicData>
+                  </a:graphic>
+                </wp:inline>
+              </w:drawing>
+            </w:r>
+            <w:r>
+              <w:rPr>
+                <w:rFonts w:ascii="Arial" w:eastAsia="Arial" w:hAnsi="Arial" w:cs="Arial"/>
+                <w:b/>
+                <w:noProof/>
+                <w:sz w:val="20"/>
+                <w:szCs w:val="20"/>
+              </w:rPr>
+              <w:drawing>
+                <wp:inline distT="0" distB="0" distL="0" distR="0" wp14:anchorId="4427B0F7" wp14:editId="7390E43F">
+                  <wp:extent cx="842434" cy="1873255"/>
+                  <wp:effectExtent l="0" t="0" r="0" b="0"/>
+                  <wp:docPr id="999261639" name="Imagem 39"/>
+                  <wp:cNvGraphicFramePr>
+                    <a:graphicFrameLocks xmlns:a="http://schemas.openxmlformats.org/drawingml/2006/main" noChangeAspect="1"/>
+                  </wp:cNvGraphicFramePr>
+                  <a:graphic xmlns:a="http://schemas.openxmlformats.org/drawingml/2006/main">
+                    <a:graphicData uri="http://schemas.openxmlformats.org/drawingml/2006/picture">
+                      <pic:pic xmlns:pic="http://schemas.openxmlformats.org/drawingml/2006/picture">
+                        <pic:nvPicPr>
+                          <pic:cNvPr id="0" name="Picture 39"/>
+                          <pic:cNvPicPr>
+                            <a:picLocks noChangeAspect="1" noChangeArrowheads="1"/>
+                          </pic:cNvPicPr>
+                        </pic:nvPicPr>
+                        <pic:blipFill>
+                          <a:blip r:embed="rId23" cstate="print">
+                            <a:extLst>
+                              <a:ext uri="{28A0092B-C50C-407E-A947-70E740481C1C}">
+                                <a14:useLocalDpi xmlns:a14="http://schemas.microsoft.com/office/drawing/2010/main" val="0"/>
+                              </a:ext>
+                            </a:extLst>
+                          </a:blip>
+                          <a:srcRect/>
+                          <a:stretch>
+                            <a:fillRect/>
+                          </a:stretch>
+                        </pic:blipFill>
+                        <pic:spPr bwMode="auto">
+                          <a:xfrm>
+                            <a:off x="0" y="0"/>
+                            <a:ext cx="862312" cy="1917456"/>
+                          </a:xfrm>
+                          <a:prstGeom prst="rect">
+                            <a:avLst/>
+                          </a:prstGeom>
+                          <a:noFill/>
+                          <a:ln>
+                            <a:noFill/>
+                          </a:ln>
+                        </pic:spPr>
+                      </pic:pic>
+                    </a:graphicData>
+                  </a:graphic>
+                </wp:inline>
+              </w:drawing>
+            </w:r>
+            <w:r>
+              <w:rPr>
+                <w:rFonts w:ascii="Arial" w:eastAsia="Arial" w:hAnsi="Arial" w:cs="Arial"/>
+                <w:b/>
+                <w:noProof/>
+                <w:sz w:val="20"/>
+                <w:szCs w:val="20"/>
+              </w:rPr>
+              <w:drawing>
+                <wp:inline distT="0" distB="0" distL="0" distR="0" wp14:anchorId="57B80568" wp14:editId="4181ACA0">
+                  <wp:extent cx="839535" cy="1866806"/>
+                  <wp:effectExtent l="0" t="0" r="0" b="635"/>
+                  <wp:docPr id="438483662" name="Imagem 40"/>
+                  <wp:cNvGraphicFramePr>
+                    <a:graphicFrameLocks xmlns:a="http://schemas.openxmlformats.org/drawingml/2006/main" noChangeAspect="1"/>
+                  </wp:cNvGraphicFramePr>
+                  <a:graphic xmlns:a="http://schemas.openxmlformats.org/drawingml/2006/main">
+                    <a:graphicData uri="http://schemas.openxmlformats.org/drawingml/2006/picture">
+                      <pic:pic xmlns:pic="http://schemas.openxmlformats.org/drawingml/2006/picture">
+                        <pic:nvPicPr>
+                          <pic:cNvPr id="0" name="Picture 40"/>
+                          <pic:cNvPicPr>
+                            <a:picLocks noChangeAspect="1" noChangeArrowheads="1"/>
+                          </pic:cNvPicPr>
+                        </pic:nvPicPr>
+                        <pic:blipFill>
+                          <a:blip r:embed="rId24" cstate="print">
+                            <a:extLst>
+                              <a:ext uri="{28A0092B-C50C-407E-A947-70E740481C1C}">
+                                <a14:useLocalDpi xmlns:a14="http://schemas.microsoft.com/office/drawing/2010/main" val="0"/>
+                              </a:ext>
+                            </a:extLst>
+                          </a:blip>
+                          <a:srcRect/>
+                          <a:stretch>
+                            <a:fillRect/>
+                          </a:stretch>
+                        </pic:blipFill>
+                        <pic:spPr bwMode="auto">
+                          <a:xfrm>
+                            <a:off x="0" y="0"/>
+                            <a:ext cx="851061" cy="1892436"/>
+                          </a:xfrm>
+                          <a:prstGeom prst="rect">
+                            <a:avLst/>
+                          </a:prstGeom>
+                          <a:noFill/>
+                          <a:ln>
+                            <a:noFill/>
+                          </a:ln>
+                        </pic:spPr>
+                      </pic:pic>
+                    </a:graphicData>
+                  </a:graphic>
+                </wp:inline>
+              </w:drawing>
+            </w:r>
+            <w:r>
+              <w:rPr>
+                <w:rFonts w:ascii="Arial" w:eastAsia="Arial" w:hAnsi="Arial" w:cs="Arial"/>
+                <w:b/>
+                <w:noProof/>
+                <w:sz w:val="20"/>
+                <w:szCs w:val="20"/>
+              </w:rPr>
+              <w:drawing>
+                <wp:inline distT="0" distB="0" distL="0" distR="0" wp14:anchorId="79879342" wp14:editId="3FBC9A8B">
+                  <wp:extent cx="842433" cy="1873249"/>
+                  <wp:effectExtent l="0" t="0" r="0" b="0"/>
+                  <wp:docPr id="1495627539" name="Imagem 41"/>
+                  <wp:cNvGraphicFramePr>
+                    <a:graphicFrameLocks xmlns:a="http://schemas.openxmlformats.org/drawingml/2006/main" noChangeAspect="1"/>
+                  </wp:cNvGraphicFramePr>
+                  <a:graphic xmlns:a="http://schemas.openxmlformats.org/drawingml/2006/main">
+                    <a:graphicData uri="http://schemas.openxmlformats.org/drawingml/2006/picture">
+                      <pic:pic xmlns:pic="http://schemas.openxmlformats.org/drawingml/2006/picture">
+                        <pic:nvPicPr>
+                          <pic:cNvPr id="0" name="Picture 41"/>
+                          <pic:cNvPicPr>
+                            <a:picLocks noChangeAspect="1" noChangeArrowheads="1"/>
+                          </pic:cNvPicPr>
+                        </pic:nvPicPr>
+                        <pic:blipFill>
+                          <a:blip r:embed="rId25" cstate="print">
+                            <a:extLst>
+                              <a:ext uri="{28A0092B-C50C-407E-A947-70E740481C1C}">
+                                <a14:useLocalDpi xmlns:a14="http://schemas.microsoft.com/office/drawing/2010/main" val="0"/>
+                              </a:ext>
+                            </a:extLst>
+                          </a:blip>
+                          <a:srcRect/>
+                          <a:stretch>
+                            <a:fillRect/>
+                          </a:stretch>
+                        </pic:blipFill>
+                        <pic:spPr bwMode="auto">
+                          <a:xfrm>
+                            <a:off x="0" y="0"/>
+                            <a:ext cx="858843" cy="1909739"/>
+                          </a:xfrm>
+                          <a:prstGeom prst="rect">
+                            <a:avLst/>
+                          </a:prstGeom>
+                          <a:noFill/>
+                          <a:ln>
+                            <a:noFill/>
+                          </a:ln>
+                        </pic:spPr>
+                      </pic:pic>
+                    </a:graphicData>
+                  </a:graphic>
+                </wp:inline>
+              </w:drawing>
             </w:r>
           </w:p>
         </w:tc>
@@ -1340,7 +2261,6 @@
         <w:rPr>
           <w:rFonts w:ascii="Arial" w:eastAsia="Arial" w:hAnsi="Arial" w:cs="Arial"/>
           <w:b/>
-          <w:color w:val="FF3333"/>
           <w:sz w:val="16"/>
           <w:szCs w:val="16"/>
         </w:rPr>
@@ -1389,19 +2309,61 @@
               <w:jc w:val="both"/>
               <w:rPr>
                 <w:rFonts w:ascii="Arial" w:eastAsia="Arial" w:hAnsi="Arial" w:cs="Arial"/>
-                <w:color w:val="FF3333"/>
-                <w:sz w:val="20"/>
-                <w:szCs w:val="20"/>
-              </w:rPr>
-            </w:pPr>
-            <w:r>
-              <w:rPr>
-                <w:rFonts w:ascii="Arial" w:eastAsia="Arial" w:hAnsi="Arial" w:cs="Arial"/>
-                <w:color w:val="525252" w:themeColor="accent3" w:themeShade="80"/>
-                <w:sz w:val="20"/>
-                <w:szCs w:val="20"/>
-              </w:rPr>
-              <w:t xml:space="preserve">Inserir os dados neste espaço. Orientações: conhecer na prática a realidade do campo de atuação. Definir e descrever o local em que a intervenção prevista na atividade de extensão pode ser implementada, lembrando que não há obrigatoriedade de esta ação ser efetivamente colocada em prática neste momento. É importante considerar intervenções tecnicamente exequíveis, sustentáveis e economicamente viáveis. </w:t>
+                <w:sz w:val="20"/>
+                <w:szCs w:val="20"/>
+              </w:rPr>
+            </w:pPr>
+            <w:r>
+              <w:rPr>
+                <w:rFonts w:ascii="Arial" w:eastAsia="Arial" w:hAnsi="Arial" w:cs="Arial"/>
+                <w:sz w:val="20"/>
+                <w:szCs w:val="20"/>
+              </w:rPr>
+              <w:t>O projeto FecapWallet foi idealizado para ser implementado no ambiente acadêmico da FECAP (Fundação Escola de Comércio Álvares Penteado), onde os estudantes enfrentam desafios relacionados à gestão de pequenos gastos diários, como alimentação na cantina, compra de materiais na livraria e pagamento de serviços internos como xerox ou biblioteca. Esse cenário acadêmico é propício para a aplicação do aplicativo, por conter uma rotina intensa de atividades e múltiplos pontos de consumo que exigem organização financeira por parte dos alunos.</w:t>
+            </w:r>
+          </w:p>
+          <w:p>
+            <w:pPr>
+              <w:pBdr>
+                <w:top w:val="nil"/>
+                <w:left w:val="nil"/>
+                <w:bottom w:val="nil"/>
+                <w:right w:val="nil"/>
+                <w:between w:val="nil"/>
+              </w:pBdr>
+              <w:spacing w:after="0" w:line="240" w:lineRule="auto"/>
+              <w:jc w:val="both"/>
+              <w:rPr>
+                <w:rFonts w:ascii="Arial" w:eastAsia="Arial" w:hAnsi="Arial" w:cs="Arial"/>
+                <w:sz w:val="20"/>
+                <w:szCs w:val="20"/>
+              </w:rPr>
+            </w:pPr>
+          </w:p>
+          <w:p>
+            <w:pPr>
+              <w:pBdr>
+                <w:top w:val="nil"/>
+                <w:left w:val="nil"/>
+                <w:bottom w:val="nil"/>
+                <w:right w:val="nil"/>
+                <w:between w:val="nil"/>
+              </w:pBdr>
+              <w:spacing w:after="0" w:line="240" w:lineRule="auto"/>
+              <w:jc w:val="both"/>
+              <w:rPr>
+                <w:rFonts w:ascii="Arial" w:eastAsia="Arial" w:hAnsi="Arial" w:cs="Arial"/>
+                <w:sz w:val="20"/>
+                <w:szCs w:val="20"/>
+              </w:rPr>
+            </w:pPr>
+            <w:r>
+              <w:rPr>
+                <w:rFonts w:ascii="Arial" w:eastAsia="Arial" w:hAnsi="Arial" w:cs="Arial"/>
+                <w:sz w:val="20"/>
+                <w:szCs w:val="20"/>
+              </w:rPr>
+              <w:t>O ambiente universitário, com estrutura de serviços internos variados, possibilita a aplicação prática do FecapWallet de forma exequível, sustentável e economicamente viável, com perspectiva de expansão para outras instituições de ensino.</w:t>
             </w:r>
           </w:p>
         </w:tc>
@@ -1424,7 +2386,6 @@
         <w:rPr>
           <w:rFonts w:ascii="Arial" w:eastAsia="Arial" w:hAnsi="Arial" w:cs="Arial"/>
           <w:b/>
-          <w:color w:val="FF3333"/>
           <w:sz w:val="16"/>
           <w:szCs w:val="16"/>
         </w:rPr>
@@ -1473,19 +2434,106 @@
               <w:jc w:val="both"/>
               <w:rPr>
                 <w:rFonts w:ascii="Arial" w:eastAsia="Arial" w:hAnsi="Arial" w:cs="Arial"/>
-                <w:color w:val="1F4E79"/>
-                <w:sz w:val="20"/>
-                <w:szCs w:val="20"/>
-              </w:rPr>
-            </w:pPr>
-            <w:r>
-              <w:rPr>
-                <w:rFonts w:ascii="Arial" w:eastAsia="Arial" w:hAnsi="Arial" w:cs="Arial"/>
-                <w:color w:val="525252" w:themeColor="accent3" w:themeShade="80"/>
-                <w:sz w:val="20"/>
-                <w:szCs w:val="20"/>
-              </w:rPr>
-              <w:t xml:space="preserve">Inserir os dados neste espaço. Orientações: buscar conhecer na prática a realidade do campo de atuação para a intervenção extensionista. Definir os sujeitos que poderão ser impactados pela intervenção. Caracterizar o público-alvo, características socioeconômicas e educacionais ou outros dados considerados relevantes. Nesta etapa poderá ser realizado um levantamento diagnóstico da comunidade, os dados podem ser obtidos na prática com base na metodologia proposta para o projeto de extensão (visitas, entrevistas, questionários, reuniões, roda de conversa, ou uso de outras ferramentas de levantamento). Adequar a proposta de acordo com as especificidades do curso. Os dados aqui inseridos também podem ser empregados na concepção do projeto propriamente dito. </w:t>
+                <w:sz w:val="20"/>
+                <w:szCs w:val="20"/>
+              </w:rPr>
+            </w:pPr>
+            <w:r>
+              <w:rPr>
+                <w:rFonts w:ascii="Arial" w:eastAsia="Arial" w:hAnsi="Arial" w:cs="Arial"/>
+                <w:sz w:val="20"/>
+                <w:szCs w:val="20"/>
+              </w:rPr>
+              <w:t>O público-alvo são estudantes do ensino superior, especialmente os matriculados na FECAP, com idade média entre 18 e 30 anos. Muitos desses alunos possuem baixa ou média renda familiar, trabalham e estudam, e apresentam dificuldades em organizar seus gastos do cotidiano acadêmico.</w:t>
+            </w:r>
+          </w:p>
+          <w:p>
+            <w:pPr>
+              <w:pBdr>
+                <w:top w:val="nil"/>
+                <w:left w:val="nil"/>
+                <w:bottom w:val="nil"/>
+                <w:right w:val="nil"/>
+                <w:between w:val="nil"/>
+              </w:pBdr>
+              <w:spacing w:after="0" w:line="240" w:lineRule="auto"/>
+              <w:jc w:val="both"/>
+              <w:rPr>
+                <w:rFonts w:ascii="Arial" w:eastAsia="Arial" w:hAnsi="Arial" w:cs="Arial"/>
+                <w:sz w:val="20"/>
+                <w:szCs w:val="20"/>
+              </w:rPr>
+            </w:pPr>
+          </w:p>
+          <w:p>
+            <w:pPr>
+              <w:pBdr>
+                <w:top w:val="nil"/>
+                <w:left w:val="nil"/>
+                <w:bottom w:val="nil"/>
+                <w:right w:val="nil"/>
+                <w:between w:val="nil"/>
+              </w:pBdr>
+              <w:spacing w:after="0" w:line="240" w:lineRule="auto"/>
+              <w:jc w:val="both"/>
+              <w:rPr>
+                <w:rFonts w:ascii="Arial" w:eastAsia="Arial" w:hAnsi="Arial" w:cs="Arial"/>
+                <w:sz w:val="20"/>
+                <w:szCs w:val="20"/>
+              </w:rPr>
+            </w:pPr>
+            <w:r>
+              <w:rPr>
+                <w:rFonts w:ascii="Arial" w:eastAsia="Arial" w:hAnsi="Arial" w:cs="Arial"/>
+                <w:sz w:val="20"/>
+                <w:szCs w:val="20"/>
+              </w:rPr>
+              <w:lastRenderedPageBreak/>
+              <w:t>Esses estudantes têm acesso a dispositivos móveis, mas nem sempre utilizam ferramentas de gestão financeira, o que impacta diretamente no controle de despesas básicas. A maioria está em processo de formação profissional e construção de autonomia, sendo esse um momento estratégico para o desenvolvimento de hábitos financeiros saudáveis.</w:t>
+            </w:r>
+          </w:p>
+          <w:p>
+            <w:pPr>
+              <w:pBdr>
+                <w:top w:val="nil"/>
+                <w:left w:val="nil"/>
+                <w:bottom w:val="nil"/>
+                <w:right w:val="nil"/>
+                <w:between w:val="nil"/>
+              </w:pBdr>
+              <w:spacing w:after="0" w:line="240" w:lineRule="auto"/>
+              <w:jc w:val="both"/>
+              <w:rPr>
+                <w:rFonts w:ascii="Arial" w:eastAsia="Arial" w:hAnsi="Arial" w:cs="Arial"/>
+                <w:sz w:val="20"/>
+                <w:szCs w:val="20"/>
+              </w:rPr>
+            </w:pPr>
+          </w:p>
+          <w:p>
+            <w:pPr>
+              <w:pBdr>
+                <w:top w:val="nil"/>
+                <w:left w:val="nil"/>
+                <w:bottom w:val="nil"/>
+                <w:right w:val="nil"/>
+                <w:between w:val="nil"/>
+              </w:pBdr>
+              <w:spacing w:after="0" w:line="240" w:lineRule="auto"/>
+              <w:jc w:val="both"/>
+              <w:rPr>
+                <w:rFonts w:ascii="Arial" w:eastAsia="Arial" w:hAnsi="Arial" w:cs="Arial"/>
+                <w:sz w:val="20"/>
+                <w:szCs w:val="20"/>
+              </w:rPr>
+            </w:pPr>
+            <w:r>
+              <w:rPr>
+                <w:rFonts w:ascii="Arial" w:eastAsia="Arial" w:hAnsi="Arial" w:cs="Arial"/>
+                <w:sz w:val="20"/>
+                <w:szCs w:val="20"/>
+              </w:rPr>
+              <w:t>Um levantamento informal (via roda de conversa e observação de campo) revelou que muitos alunos realizam pequenos gastos diários sem controle e não monitoram seus saldos, especialmente em aplicativos de pagamento integrados à cantina, o que reforça a importância do projeto.</w:t>
             </w:r>
           </w:p>
         </w:tc>
@@ -1556,38 +2604,61 @@
               <w:jc w:val="both"/>
               <w:rPr>
                 <w:rFonts w:ascii="Arial" w:eastAsia="Arial" w:hAnsi="Arial" w:cs="Arial"/>
-                <w:color w:val="1F4E79"/>
-                <w:sz w:val="20"/>
-                <w:szCs w:val="20"/>
-              </w:rPr>
-            </w:pPr>
-            <w:r>
-              <w:rPr>
-                <w:rFonts w:ascii="Arial" w:eastAsia="Arial" w:hAnsi="Arial" w:cs="Arial"/>
-                <w:color w:val="525252" w:themeColor="accent3" w:themeShade="80"/>
-                <w:sz w:val="20"/>
-                <w:szCs w:val="20"/>
-              </w:rPr>
-              <w:t>Inserir os dados neste espaço. Orientações:</w:t>
-            </w:r>
-            <w:r>
-              <w:rPr>
-                <w:rFonts w:ascii="Arial" w:eastAsia="Arial" w:hAnsi="Arial" w:cs="Arial"/>
-                <w:b/>
-                <w:color w:val="525252" w:themeColor="accent3" w:themeShade="80"/>
-                <w:sz w:val="16"/>
-                <w:szCs w:val="16"/>
-              </w:rPr>
-              <w:t xml:space="preserve"> </w:t>
-            </w:r>
-            <w:r>
-              <w:rPr>
-                <w:rFonts w:ascii="Arial" w:eastAsia="Arial" w:hAnsi="Arial" w:cs="Arial"/>
-                <w:color w:val="525252" w:themeColor="accent3" w:themeShade="80"/>
-                <w:sz w:val="20"/>
-                <w:szCs w:val="20"/>
-              </w:rPr>
-              <w:t xml:space="preserve">observar a realidade em si, identificar os postos-chave, os problemas apontados e suas características para que o plano de intervenção possa contribuir na transformação da realidade observada. Selecionar o problema que será objeto da intervenção e apresentar argumentos relativos à sua relevância de estudo. Os dados aqui inseridos também podem ser empregados na concepção do projeto propriamente dito. </w:t>
+                <w:sz w:val="20"/>
+                <w:szCs w:val="20"/>
+              </w:rPr>
+            </w:pPr>
+            <w:r>
+              <w:rPr>
+                <w:rFonts w:ascii="Arial" w:eastAsia="Arial" w:hAnsi="Arial" w:cs="Arial"/>
+                <w:sz w:val="20"/>
+                <w:szCs w:val="20"/>
+              </w:rPr>
+              <w:t>O principal problema identificado é a falta de controle e organização financeira dos estudantes em relação aos gastos cotidianos no ambiente acadêmico, o que pode gerar desequilíbrios financeiros mesmo em despesas de pequeno valor. A ausência de ferramentas específicas voltadas para esse contexto contribui para a desorganização financeira e a perda de visibilidade dos próprios gastos.</w:t>
+            </w:r>
+          </w:p>
+          <w:p>
+            <w:pPr>
+              <w:pBdr>
+                <w:top w:val="nil"/>
+                <w:left w:val="nil"/>
+                <w:bottom w:val="nil"/>
+                <w:right w:val="nil"/>
+                <w:between w:val="nil"/>
+              </w:pBdr>
+              <w:spacing w:after="0" w:line="240" w:lineRule="auto"/>
+              <w:jc w:val="both"/>
+              <w:rPr>
+                <w:rFonts w:ascii="Arial" w:eastAsia="Arial" w:hAnsi="Arial" w:cs="Arial"/>
+                <w:sz w:val="20"/>
+                <w:szCs w:val="20"/>
+              </w:rPr>
+            </w:pPr>
+          </w:p>
+          <w:p>
+            <w:pPr>
+              <w:pBdr>
+                <w:top w:val="nil"/>
+                <w:left w:val="nil"/>
+                <w:bottom w:val="nil"/>
+                <w:right w:val="nil"/>
+                <w:between w:val="nil"/>
+              </w:pBdr>
+              <w:spacing w:after="0" w:line="240" w:lineRule="auto"/>
+              <w:jc w:val="both"/>
+              <w:rPr>
+                <w:rFonts w:ascii="Arial" w:eastAsia="Arial" w:hAnsi="Arial" w:cs="Arial"/>
+                <w:sz w:val="20"/>
+                <w:szCs w:val="20"/>
+              </w:rPr>
+            </w:pPr>
+            <w:r>
+              <w:rPr>
+                <w:rFonts w:ascii="Arial" w:eastAsia="Arial" w:hAnsi="Arial" w:cs="Arial"/>
+                <w:sz w:val="20"/>
+                <w:szCs w:val="20"/>
+              </w:rPr>
+              <w:t>O objeto de estudo e intervenção é, portanto, o desenvolvimento de um aplicativo mobile (FecapWallet) que centralize e facilite a gestão de despesas realizadas dentro do ambiente acadêmico, com funcionalidades específicas para esse público, como extrato digital, cartão de saldo e histórico de transações</w:t>
             </w:r>
           </w:p>
         </w:tc>
@@ -1658,48 +2729,17 @@
               <w:jc w:val="both"/>
               <w:rPr>
                 <w:rFonts w:ascii="Arial" w:eastAsia="Arial" w:hAnsi="Arial" w:cs="Arial"/>
-                <w:color w:val="FF3333"/>
-                <w:sz w:val="20"/>
-                <w:szCs w:val="20"/>
-              </w:rPr>
-            </w:pPr>
-            <w:r>
-              <w:rPr>
-                <w:rFonts w:ascii="Arial" w:eastAsia="Arial" w:hAnsi="Arial" w:cs="Arial"/>
-                <w:color w:val="525252" w:themeColor="accent3" w:themeShade="80"/>
-                <w:sz w:val="20"/>
-                <w:szCs w:val="20"/>
-              </w:rPr>
-              <w:t>Inserir os dados neste espaço. Orientações:</w:t>
-            </w:r>
-            <w:r>
-              <w:rPr>
-                <w:rFonts w:ascii="Arial" w:eastAsia="Arial" w:hAnsi="Arial" w:cs="Arial"/>
-                <w:b/>
-                <w:color w:val="525252" w:themeColor="accent3" w:themeShade="80"/>
-                <w:sz w:val="16"/>
-                <w:szCs w:val="16"/>
-              </w:rPr>
-              <w:t xml:space="preserve"> </w:t>
-            </w:r>
-            <w:r>
-              <w:rPr>
-                <w:rFonts w:ascii="Arial" w:eastAsia="Arial" w:hAnsi="Arial" w:cs="Arial"/>
-                <w:color w:val="525252" w:themeColor="accent3" w:themeShade="80"/>
-                <w:sz w:val="20"/>
-                <w:szCs w:val="20"/>
-              </w:rPr>
-              <w:t>as hipóteses devem ser construídas após a teorização e estudo do problema observado. Relacionar hipóteses de intervenção para solução do problema de estudo e selecionar a mais adequada. É importante considerar intervenções tecnicamente exequíveis, sustentáveis e economicamente viáveis</w:t>
-            </w:r>
-            <w:r>
-              <w:rPr>
-                <w:rFonts w:ascii="Arial" w:eastAsia="Arial" w:hAnsi="Arial" w:cs="Arial"/>
-                <w:b/>
-                <w:color w:val="525252" w:themeColor="accent3" w:themeShade="80"/>
-                <w:sz w:val="16"/>
-                <w:szCs w:val="16"/>
-              </w:rPr>
-              <w:t>.</w:t>
+                <w:sz w:val="20"/>
+                <w:szCs w:val="20"/>
+              </w:rPr>
+            </w:pPr>
+            <w:r>
+              <w:rPr>
+                <w:rFonts w:ascii="Arial" w:eastAsia="Arial" w:hAnsi="Arial" w:cs="Arial"/>
+                <w:sz w:val="20"/>
+                <w:szCs w:val="20"/>
+              </w:rPr>
+              <w:t>A implementação de um aplicativo Android com funcionalidades específicas para controle de gastos acadêmicos contribuirá significativamente para a melhoria da organização financeira dos estudantes, promovendo maior consciência e autonomia.</w:t>
             </w:r>
           </w:p>
         </w:tc>
@@ -1837,7 +2877,6 @@
         <w:rPr>
           <w:rFonts w:ascii="Arial" w:eastAsia="Arial" w:hAnsi="Arial" w:cs="Arial"/>
           <w:b/>
-          <w:color w:val="525252" w:themeColor="accent3" w:themeShade="80"/>
           <w:sz w:val="16"/>
           <w:szCs w:val="16"/>
         </w:rPr>
@@ -1846,7 +2885,6 @@
         <w:rPr>
           <w:rFonts w:ascii="Arial" w:eastAsia="Arial" w:hAnsi="Arial" w:cs="Arial"/>
           <w:b/>
-          <w:color w:val="525252" w:themeColor="accent3" w:themeShade="80"/>
           <w:sz w:val="16"/>
           <w:szCs w:val="16"/>
         </w:rPr>
@@ -1910,38 +2948,17 @@
               <w:jc w:val="both"/>
               <w:rPr>
                 <w:rFonts w:ascii="Arial" w:eastAsia="Arial" w:hAnsi="Arial" w:cs="Arial"/>
-                <w:color w:val="000000"/>
-                <w:sz w:val="20"/>
-                <w:szCs w:val="20"/>
-              </w:rPr>
-            </w:pPr>
-            <w:r>
-              <w:rPr>
-                <w:rFonts w:ascii="Arial" w:eastAsia="Arial" w:hAnsi="Arial" w:cs="Arial"/>
-                <w:color w:val="525252" w:themeColor="accent3" w:themeShade="80"/>
-                <w:sz w:val="20"/>
-                <w:szCs w:val="20"/>
-              </w:rPr>
-              <w:t>Inserir os dados neste espaço. Orientações:</w:t>
-            </w:r>
-            <w:r>
-              <w:rPr>
-                <w:rFonts w:ascii="Arial" w:eastAsia="Arial" w:hAnsi="Arial" w:cs="Arial"/>
-                <w:b/>
-                <w:color w:val="525252" w:themeColor="accent3" w:themeShade="80"/>
-                <w:sz w:val="16"/>
-                <w:szCs w:val="16"/>
-              </w:rPr>
-              <w:t xml:space="preserve"> </w:t>
-            </w:r>
-            <w:r>
-              <w:rPr>
-                <w:rFonts w:ascii="Arial" w:eastAsia="Arial" w:hAnsi="Arial" w:cs="Arial"/>
-                <w:color w:val="525252" w:themeColor="accent3" w:themeShade="80"/>
-                <w:sz w:val="20"/>
-                <w:szCs w:val="20"/>
-              </w:rPr>
-              <w:t xml:space="preserve">texto sem parágrafos. Trata-se de um resumo, apresentado de forma sintética, clara, objetiva e concisa, dos pontos mais importantes da proposta do projeto: breve descrição do estudo, o problema a ser focado, público-alvo ou comunidade que será envolvido na ação extensionista, o objetivo geral da ação extensionista, as metodologias a serem utilizadas, as atividades previstas, os resultados esperados, e outras informações que forem consideradas relevantes. Escrever um texto curto. </w:t>
+                <w:sz w:val="20"/>
+                <w:szCs w:val="20"/>
+              </w:rPr>
+            </w:pPr>
+            <w:r>
+              <w:rPr>
+                <w:rFonts w:ascii="Arial" w:eastAsia="Arial" w:hAnsi="Arial" w:cs="Arial"/>
+                <w:sz w:val="20"/>
+                <w:szCs w:val="20"/>
+              </w:rPr>
+              <w:t>O projeto FecapWallet tem como objetivo o desenvolvimento de um aplicativo mobile Android que auxilie estudantes da FECAP na organização de suas finanças pessoais, com foco em despesas acadêmicas como cantina, boletos, biblioteca e livraria. A proposta surge da observação das dificuldades enfrentadas pelos alunos em controlar seus pequenos gastos diários e da necessidade de uma solução centralizada, prática e acessível. O FecapWallet foi desenvolvido no Android Studio com a linguagem Java, buscando integrar em um único ambiente digital todos os recursos necessários para facilitar a rotina acadêmica e financeira dos estudantes. A metodologia envolveu diagnóstico da realidade estudantil, desenvolvimento técnico, design de interface amigável e testes de usabilidade. Espera-se que o projeto promova maior organização financeira, consciência de consumo e facilidade na rotina diária dos alunos.</w:t>
             </w:r>
           </w:p>
         </w:tc>
@@ -2013,58 +3030,30 @@
             <w:r>
               <w:rPr>
                 <w:rFonts w:ascii="Arial" w:eastAsia="Arial" w:hAnsi="Arial" w:cs="Arial"/>
-                <w:color w:val="525252" w:themeColor="accent3" w:themeShade="80"/>
-                <w:sz w:val="20"/>
-                <w:szCs w:val="20"/>
-              </w:rPr>
-              <w:t>Inserir os dados neste espaço. Orientações:</w:t>
-            </w:r>
-            <w:r>
-              <w:rPr>
-                <w:rFonts w:ascii="Arial" w:eastAsia="Arial" w:hAnsi="Arial" w:cs="Arial"/>
-                <w:b/>
-                <w:color w:val="525252" w:themeColor="accent3" w:themeShade="80"/>
-                <w:sz w:val="16"/>
-                <w:szCs w:val="16"/>
-              </w:rPr>
-              <w:t xml:space="preserve"> </w:t>
-            </w:r>
-            <w:r>
-              <w:rPr>
-                <w:rFonts w:ascii="Arial" w:eastAsia="Arial" w:hAnsi="Arial" w:cs="Arial"/>
-                <w:color w:val="525252" w:themeColor="accent3" w:themeShade="80"/>
-                <w:sz w:val="20"/>
-                <w:szCs w:val="20"/>
-              </w:rPr>
-              <w:t xml:space="preserve">apresentar a introdução com base na fundamentação teórica sobre o tema trabalhado e que situe o objeto da intervenção, afirmando sua relevância. </w:t>
-            </w:r>
-            <w:r>
-              <w:rPr>
-                <w:rFonts w:ascii="Arial" w:eastAsia="Arial" w:hAnsi="Arial" w:cs="Arial"/>
-                <w:color w:val="525252" w:themeColor="accent3" w:themeShade="80"/>
+                <w:sz w:val="20"/>
+                <w:szCs w:val="20"/>
+              </w:rPr>
+              <w:t>A rotina acadêmica de um estudante universitário é composta por diversos compromissos e pequenas despesas, muitas vezes negligenciadas no dia a dia. Na FECAP, observou-se a ausência de uma ferramenta digital que centralizasse as informações financeiras dos estudantes, como gastos na cantina, livraria, biblioteca e boletos. Com base nessa realidade, nasceu o FecapWallet, um aplicativo Android que visa ser um centro de controle financeiro pessoal e acadêmico.</w:t>
+            </w:r>
+          </w:p>
+          <w:p>
+            <w:pPr>
+              <w:spacing w:after="0" w:line="240" w:lineRule="auto"/>
+              <w:jc w:val="both"/>
+              <w:rPr>
+                <w:rFonts w:ascii="Arial" w:eastAsia="Arial" w:hAnsi="Arial" w:cs="Arial"/>
+                <w:sz w:val="20"/>
+                <w:szCs w:val="20"/>
+              </w:rPr>
+            </w:pPr>
+            <w:r>
+              <w:rPr>
+                <w:rFonts w:ascii="Arial" w:eastAsia="Arial" w:hAnsi="Arial" w:cs="Arial"/>
                 <w:sz w:val="20"/>
                 <w:szCs w:val="20"/>
               </w:rPr>
               <w:lastRenderedPageBreak/>
-              <w:t>Descrever as áreas e ODS impactados, incluir o referencial teórico, usar referências segundo ABNT. Não se trata de uma monografia e sim de uma atividade de extensão, por isso a introdução deve ser clara, objetiva</w:t>
-            </w:r>
-            <w:r>
-              <w:rPr>
-                <w:rFonts w:ascii="Arial" w:eastAsia="Arial" w:hAnsi="Arial" w:cs="Arial"/>
-                <w:color w:val="525252" w:themeColor="accent3" w:themeShade="80"/>
-                <w:sz w:val="20"/>
-                <w:szCs w:val="20"/>
-              </w:rPr>
-              <w:t xml:space="preserve"> </w:t>
-            </w:r>
-            <w:r>
-              <w:rPr>
-                <w:rFonts w:ascii="Arial" w:eastAsia="Arial" w:hAnsi="Arial" w:cs="Arial"/>
-                <w:color w:val="525252" w:themeColor="accent3" w:themeShade="80"/>
-                <w:sz w:val="20"/>
-                <w:szCs w:val="20"/>
-              </w:rPr>
-              <w:t xml:space="preserve">e sintética. </w:t>
+              <w:t>A proposta atende às demandas da geração atual, que está conectada e acostumada a usar o celular como ferramenta de apoio diário. Com base no conceito de “one-stop app” (aplicativo centralizador), o projeto busca facilitar o cotidiano estudantil, concentrando em uma só plataforma dados que antes estariam dispersos.</w:t>
             </w:r>
           </w:p>
         </w:tc>
@@ -2131,39 +3120,194 @@
               <w:jc w:val="both"/>
               <w:rPr>
                 <w:rFonts w:ascii="Arial" w:eastAsia="Arial" w:hAnsi="Arial" w:cs="Arial"/>
-                <w:color w:val="FF3333"/>
-                <w:sz w:val="20"/>
-                <w:szCs w:val="20"/>
-              </w:rPr>
-            </w:pPr>
-            <w:r>
-              <w:rPr>
-                <w:rFonts w:ascii="Arial" w:eastAsia="Arial" w:hAnsi="Arial" w:cs="Arial"/>
-                <w:color w:val="525252" w:themeColor="accent3" w:themeShade="80"/>
-                <w:sz w:val="20"/>
-                <w:szCs w:val="20"/>
-              </w:rPr>
-              <w:t>Inserir os dados neste espaço. Orientações:</w:t>
-            </w:r>
-            <w:r>
-              <w:rPr>
-                <w:rFonts w:ascii="Arial" w:eastAsia="Arial" w:hAnsi="Arial" w:cs="Arial"/>
-                <w:b/>
-                <w:color w:val="525252" w:themeColor="accent3" w:themeShade="80"/>
-                <w:sz w:val="16"/>
-                <w:szCs w:val="16"/>
-              </w:rPr>
-              <w:t xml:space="preserve"> </w:t>
-            </w:r>
-            <w:r>
-              <w:rPr>
-                <w:rFonts w:ascii="Arial" w:eastAsia="Arial" w:hAnsi="Arial" w:cs="Arial"/>
-                <w:color w:val="525252" w:themeColor="accent3" w:themeShade="80"/>
-                <w:sz w:val="20"/>
-                <w:szCs w:val="20"/>
-              </w:rPr>
-              <w:t>Descrever os objetivos de forma clara. Cada objetivo deve ter uma correspondência com os resultados esperados. Devem ser expressos sucintamente, em itens, iniciando a frase com verbo de ação e não em forma de relatos.</w:t>
-            </w:r>
+                <w:b/>
+                <w:bCs/>
+                <w:sz w:val="20"/>
+                <w:szCs w:val="20"/>
+              </w:rPr>
+            </w:pPr>
+            <w:r>
+              <w:rPr>
+                <w:rFonts w:ascii="Arial" w:eastAsia="Arial" w:hAnsi="Arial" w:cs="Arial"/>
+                <w:b/>
+                <w:bCs/>
+                <w:sz w:val="20"/>
+                <w:szCs w:val="20"/>
+              </w:rPr>
+              <w:t>Objetivo Geral:</w:t>
+            </w:r>
+          </w:p>
+          <w:p>
+            <w:pPr>
+              <w:tabs>
+                <w:tab w:val="left" w:pos="360"/>
+              </w:tabs>
+              <w:spacing w:after="0" w:line="240" w:lineRule="auto"/>
+              <w:jc w:val="both"/>
+              <w:rPr>
+                <w:rFonts w:ascii="Arial" w:eastAsia="Arial" w:hAnsi="Arial" w:cs="Arial"/>
+                <w:sz w:val="20"/>
+                <w:szCs w:val="20"/>
+              </w:rPr>
+            </w:pPr>
+            <w:r>
+              <w:rPr>
+                <w:rFonts w:ascii="Arial" w:eastAsia="Arial" w:hAnsi="Arial" w:cs="Arial"/>
+                <w:sz w:val="20"/>
+                <w:szCs w:val="20"/>
+              </w:rPr>
+              <w:t>Desenvolver um aplicativo Android para centralizar e facilitar a gestão financeira e acadêmica dos estudantes da FECAP.</w:t>
+            </w:r>
+          </w:p>
+          <w:p>
+            <w:pPr>
+              <w:tabs>
+                <w:tab w:val="left" w:pos="360"/>
+              </w:tabs>
+              <w:spacing w:after="0" w:line="240" w:lineRule="auto"/>
+              <w:jc w:val="both"/>
+              <w:rPr>
+                <w:rFonts w:ascii="Arial" w:eastAsia="Arial" w:hAnsi="Arial" w:cs="Arial"/>
+                <w:b/>
+                <w:bCs/>
+                <w:sz w:val="20"/>
+                <w:szCs w:val="20"/>
+              </w:rPr>
+            </w:pPr>
+            <w:r>
+              <w:rPr>
+                <w:rFonts w:ascii="Arial" w:eastAsia="Arial" w:hAnsi="Arial" w:cs="Arial"/>
+                <w:b/>
+                <w:bCs/>
+                <w:sz w:val="20"/>
+                <w:szCs w:val="20"/>
+              </w:rPr>
+              <w:t>Objetivos Específicos:</w:t>
+            </w:r>
+          </w:p>
+          <w:p>
+            <w:pPr>
+              <w:tabs>
+                <w:tab w:val="left" w:pos="360"/>
+              </w:tabs>
+              <w:spacing w:after="0" w:line="240" w:lineRule="auto"/>
+              <w:jc w:val="both"/>
+              <w:rPr>
+                <w:rFonts w:ascii="Arial" w:eastAsia="Arial" w:hAnsi="Arial" w:cs="Arial"/>
+                <w:sz w:val="20"/>
+                <w:szCs w:val="20"/>
+              </w:rPr>
+            </w:pPr>
+            <w:r>
+              <w:rPr>
+                <w:rFonts w:ascii="Arial" w:eastAsia="Arial" w:hAnsi="Arial" w:cs="Arial"/>
+                <w:sz w:val="20"/>
+                <w:szCs w:val="20"/>
+              </w:rPr>
+              <w:t>Identificar as principais dificuldades financeiras enfrentadas por alunos da FECAP.</w:t>
+            </w:r>
+          </w:p>
+          <w:p>
+            <w:pPr>
+              <w:tabs>
+                <w:tab w:val="left" w:pos="360"/>
+              </w:tabs>
+              <w:spacing w:after="0" w:line="240" w:lineRule="auto"/>
+              <w:jc w:val="both"/>
+              <w:rPr>
+                <w:rFonts w:ascii="Arial" w:eastAsia="Arial" w:hAnsi="Arial" w:cs="Arial"/>
+                <w:sz w:val="20"/>
+                <w:szCs w:val="20"/>
+              </w:rPr>
+            </w:pPr>
+            <w:r>
+              <w:rPr>
+                <w:rFonts w:ascii="Arial" w:eastAsia="Arial" w:hAnsi="Arial" w:cs="Arial"/>
+                <w:sz w:val="20"/>
+                <w:szCs w:val="20"/>
+              </w:rPr>
+              <w:t>Criar uma interface intuitiva que concentre funcionalidades úteis ao cotidiano acadêmico.</w:t>
+            </w:r>
+          </w:p>
+          <w:p>
+            <w:pPr>
+              <w:tabs>
+                <w:tab w:val="left" w:pos="360"/>
+              </w:tabs>
+              <w:spacing w:after="0" w:line="240" w:lineRule="auto"/>
+              <w:jc w:val="both"/>
+              <w:rPr>
+                <w:rFonts w:ascii="Arial" w:eastAsia="Arial" w:hAnsi="Arial" w:cs="Arial"/>
+                <w:sz w:val="20"/>
+                <w:szCs w:val="20"/>
+              </w:rPr>
+            </w:pPr>
+            <w:r>
+              <w:rPr>
+                <w:rFonts w:ascii="Arial" w:eastAsia="Arial" w:hAnsi="Arial" w:cs="Arial"/>
+                <w:sz w:val="20"/>
+                <w:szCs w:val="20"/>
+              </w:rPr>
+              <w:t>Implementar recursos como visualização de saldo, extrato, perfil e informações de uso institucional.</w:t>
+            </w:r>
+          </w:p>
+          <w:p>
+            <w:pPr>
+              <w:tabs>
+                <w:tab w:val="left" w:pos="360"/>
+              </w:tabs>
+              <w:spacing w:after="0" w:line="240" w:lineRule="auto"/>
+              <w:jc w:val="both"/>
+              <w:rPr>
+                <w:rFonts w:ascii="Arial" w:eastAsia="Arial" w:hAnsi="Arial" w:cs="Arial"/>
+                <w:sz w:val="20"/>
+                <w:szCs w:val="20"/>
+              </w:rPr>
+            </w:pPr>
+            <w:r>
+              <w:rPr>
+                <w:rFonts w:ascii="Arial" w:eastAsia="Arial" w:hAnsi="Arial" w:cs="Arial"/>
+                <w:sz w:val="20"/>
+                <w:szCs w:val="20"/>
+              </w:rPr>
+              <w:t>Promover hábitos de organização e planejamento financeiro.</w:t>
+            </w:r>
+          </w:p>
+          <w:p>
+            <w:pPr>
+              <w:tabs>
+                <w:tab w:val="left" w:pos="360"/>
+              </w:tabs>
+              <w:spacing w:after="0" w:line="240" w:lineRule="auto"/>
+              <w:jc w:val="both"/>
+              <w:rPr>
+                <w:rFonts w:ascii="Arial" w:eastAsia="Arial" w:hAnsi="Arial" w:cs="Arial"/>
+                <w:sz w:val="20"/>
+                <w:szCs w:val="20"/>
+              </w:rPr>
+            </w:pPr>
+            <w:r>
+              <w:rPr>
+                <w:rFonts w:ascii="Arial" w:eastAsia="Arial" w:hAnsi="Arial" w:cs="Arial"/>
+                <w:sz w:val="20"/>
+                <w:szCs w:val="20"/>
+              </w:rPr>
+              <w:t>Integrar tecnologia ao contexto estudantil de forma prática e acessível.</w:t>
+            </w:r>
+          </w:p>
+          <w:p>
+            <w:pPr>
+              <w:tabs>
+                <w:tab w:val="left" w:pos="360"/>
+              </w:tabs>
+              <w:spacing w:after="0" w:line="240" w:lineRule="auto"/>
+              <w:jc w:val="both"/>
+              <w:rPr>
+                <w:rFonts w:ascii="Arial" w:eastAsia="Arial" w:hAnsi="Arial" w:cs="Arial"/>
+                <w:sz w:val="20"/>
+                <w:szCs w:val="20"/>
+              </w:rPr>
+            </w:pPr>
           </w:p>
         </w:tc>
       </w:tr>
@@ -2231,30 +3375,175 @@
             <w:r>
               <w:rPr>
                 <w:rFonts w:ascii="Arial" w:eastAsia="Arial" w:hAnsi="Arial" w:cs="Arial"/>
-                <w:color w:val="525252" w:themeColor="accent3" w:themeShade="80"/>
-                <w:sz w:val="20"/>
-                <w:szCs w:val="20"/>
-              </w:rPr>
-              <w:t>Inserir os dados neste espaço. Orientações:</w:t>
-            </w:r>
-            <w:r>
-              <w:rPr>
-                <w:rFonts w:ascii="Arial" w:eastAsia="Arial" w:hAnsi="Arial" w:cs="Arial"/>
-                <w:b/>
-                <w:color w:val="525252" w:themeColor="accent3" w:themeShade="80"/>
-                <w:sz w:val="16"/>
-                <w:szCs w:val="16"/>
-              </w:rPr>
-              <w:t xml:space="preserve"> </w:t>
-            </w:r>
-            <w:r>
-              <w:rPr>
-                <w:rFonts w:ascii="Arial" w:eastAsia="Arial" w:hAnsi="Arial" w:cs="Arial"/>
-                <w:color w:val="525252" w:themeColor="accent3" w:themeShade="80"/>
-                <w:sz w:val="20"/>
-                <w:szCs w:val="20"/>
-              </w:rPr>
-              <w:t xml:space="preserve">descrever como ocorrerá a ação extensionista junto ao público-alvo. Trata-se descrição sobre como será realizada a prática da ação extensionista, é o detalhamento do caminho a ser percorrido pela equipe em sua interação com a sociedade. Descrever os métodos, técnicas e estratégias para a implementação das atividades de intervenção previstas no projeto e sua contribuição para o alcance dos objetivos. Descrever o local, público-alvo, ferramentas empregadas para a relação dialógica com a comunidade ou setores da sociedade: visitas, entrevistas, questionários, reuniões, roda de conversa, ou uso de outras ferramentas de levantamento. Detalhar os procedimentos e as atividades a serem implementadas. </w:t>
+                <w:sz w:val="20"/>
+                <w:szCs w:val="20"/>
+              </w:rPr>
+              <w:t>O projeto foi desenvolvido a partir das seguintes etapas:</w:t>
+            </w:r>
+          </w:p>
+          <w:p>
+            <w:pPr>
+              <w:numPr>
+                <w:ilvl w:val="0"/>
+                <w:numId w:val="3"/>
+              </w:numPr>
+              <w:spacing w:after="0" w:line="240" w:lineRule="auto"/>
+              <w:jc w:val="both"/>
+              <w:rPr>
+                <w:rFonts w:ascii="Arial" w:eastAsia="Arial" w:hAnsi="Arial" w:cs="Arial"/>
+                <w:sz w:val="20"/>
+                <w:szCs w:val="20"/>
+              </w:rPr>
+            </w:pPr>
+            <w:r>
+              <w:rPr>
+                <w:rFonts w:ascii="Arial" w:eastAsia="Arial" w:hAnsi="Arial" w:cs="Arial"/>
+                <w:b/>
+                <w:bCs/>
+                <w:sz w:val="20"/>
+                <w:szCs w:val="20"/>
+              </w:rPr>
+              <w:t>Diagnóstico da realidade</w:t>
+            </w:r>
+            <w:r>
+              <w:rPr>
+                <w:rFonts w:ascii="Arial" w:eastAsia="Arial" w:hAnsi="Arial" w:cs="Arial"/>
+                <w:sz w:val="20"/>
+                <w:szCs w:val="20"/>
+              </w:rPr>
+              <w:t>: Por meio de conversas com alunos e observação direta, identificou-se a carência de uma ferramenta que centralizasse as informações financeiras e acadêmicas dos estudantes.</w:t>
+            </w:r>
+          </w:p>
+          <w:p>
+            <w:pPr>
+              <w:numPr>
+                <w:ilvl w:val="0"/>
+                <w:numId w:val="3"/>
+              </w:numPr>
+              <w:spacing w:after="0" w:line="240" w:lineRule="auto"/>
+              <w:jc w:val="both"/>
+              <w:rPr>
+                <w:rFonts w:ascii="Arial" w:eastAsia="Arial" w:hAnsi="Arial" w:cs="Arial"/>
+                <w:sz w:val="20"/>
+                <w:szCs w:val="20"/>
+              </w:rPr>
+            </w:pPr>
+            <w:r>
+              <w:rPr>
+                <w:rFonts w:ascii="Arial" w:eastAsia="Arial" w:hAnsi="Arial" w:cs="Arial"/>
+                <w:b/>
+                <w:bCs/>
+                <w:sz w:val="20"/>
+                <w:szCs w:val="20"/>
+              </w:rPr>
+              <w:t>Planejamento da solução</w:t>
+            </w:r>
+            <w:r>
+              <w:rPr>
+                <w:rFonts w:ascii="Arial" w:eastAsia="Arial" w:hAnsi="Arial" w:cs="Arial"/>
+                <w:sz w:val="20"/>
+                <w:szCs w:val="20"/>
+              </w:rPr>
+              <w:t>: Com base nas informações coletadas, definiu-se o escopo do app como uma plataforma unificada para acompanhamento financeiro e facilitação da rotina acadêmica.</w:t>
+            </w:r>
+          </w:p>
+          <w:p>
+            <w:pPr>
+              <w:numPr>
+                <w:ilvl w:val="0"/>
+                <w:numId w:val="3"/>
+              </w:numPr>
+              <w:spacing w:after="0" w:line="240" w:lineRule="auto"/>
+              <w:jc w:val="both"/>
+              <w:rPr>
+                <w:rFonts w:ascii="Arial" w:eastAsia="Arial" w:hAnsi="Arial" w:cs="Arial"/>
+                <w:sz w:val="20"/>
+                <w:szCs w:val="20"/>
+              </w:rPr>
+            </w:pPr>
+            <w:r>
+              <w:rPr>
+                <w:rFonts w:ascii="Arial" w:eastAsia="Arial" w:hAnsi="Arial" w:cs="Arial"/>
+                <w:b/>
+                <w:bCs/>
+                <w:sz w:val="20"/>
+                <w:szCs w:val="20"/>
+              </w:rPr>
+              <w:t>Desenvolvimento técnico</w:t>
+            </w:r>
+            <w:r>
+              <w:rPr>
+                <w:rFonts w:ascii="Arial" w:eastAsia="Arial" w:hAnsi="Arial" w:cs="Arial"/>
+                <w:sz w:val="20"/>
+                <w:szCs w:val="20"/>
+              </w:rPr>
+              <w:t>: Utilizando o Android Studio e a linguagem Java, o aplicativo foi estruturado com uma splash screen, carrossel introdutório, tela de login, cartão digital, extrato de gastos, área de perfil e funcionalidades que organizam os gastos da rotina universitária.</w:t>
+            </w:r>
+          </w:p>
+          <w:p>
+            <w:pPr>
+              <w:numPr>
+                <w:ilvl w:val="0"/>
+                <w:numId w:val="3"/>
+              </w:numPr>
+              <w:spacing w:after="0" w:line="240" w:lineRule="auto"/>
+              <w:jc w:val="both"/>
+              <w:rPr>
+                <w:rFonts w:ascii="Arial" w:eastAsia="Arial" w:hAnsi="Arial" w:cs="Arial"/>
+                <w:sz w:val="20"/>
+                <w:szCs w:val="20"/>
+              </w:rPr>
+            </w:pPr>
+            <w:r>
+              <w:rPr>
+                <w:rFonts w:ascii="Arial" w:eastAsia="Arial" w:hAnsi="Arial" w:cs="Arial"/>
+                <w:b/>
+                <w:bCs/>
+                <w:sz w:val="20"/>
+                <w:szCs w:val="20"/>
+              </w:rPr>
+              <w:t>Ferramentas utilizadas</w:t>
+            </w:r>
+            <w:r>
+              <w:rPr>
+                <w:rFonts w:ascii="Arial" w:eastAsia="Arial" w:hAnsi="Arial" w:cs="Arial"/>
+                <w:sz w:val="20"/>
+                <w:szCs w:val="20"/>
+              </w:rPr>
+              <w:t>: Android Studio, Java, XML para o layout das telas, MySQL para armazenamento e integração de dados.</w:t>
+            </w:r>
+          </w:p>
+          <w:p>
+            <w:pPr>
+              <w:numPr>
+                <w:ilvl w:val="0"/>
+                <w:numId w:val="3"/>
+              </w:numPr>
+              <w:spacing w:after="0" w:line="240" w:lineRule="auto"/>
+              <w:jc w:val="both"/>
+              <w:rPr>
+                <w:rFonts w:ascii="Arial" w:eastAsia="Arial" w:hAnsi="Arial" w:cs="Arial"/>
+                <w:sz w:val="20"/>
+                <w:szCs w:val="20"/>
+              </w:rPr>
+            </w:pPr>
+            <w:r>
+              <w:rPr>
+                <w:rFonts w:ascii="Arial" w:eastAsia="Arial" w:hAnsi="Arial" w:cs="Arial"/>
+                <w:b/>
+                <w:bCs/>
+                <w:sz w:val="20"/>
+                <w:szCs w:val="20"/>
+              </w:rPr>
+              <w:t>Testes e validação</w:t>
+            </w:r>
+            <w:r>
+              <w:rPr>
+                <w:rFonts w:ascii="Arial" w:eastAsia="Arial" w:hAnsi="Arial" w:cs="Arial"/>
+                <w:sz w:val="20"/>
+                <w:szCs w:val="20"/>
+              </w:rPr>
+              <w:t>: Realização de testes com usuários para validar a usabilidade e eficácia da solução proposta.</w:t>
             </w:r>
           </w:p>
         </w:tc>
@@ -2324,11 +3613,10 @@
             <w:r>
               <w:rPr>
                 <w:rFonts w:ascii="Arial" w:eastAsia="Arial" w:hAnsi="Arial" w:cs="Arial"/>
-                <w:color w:val="525252" w:themeColor="accent3" w:themeShade="80"/>
-                <w:sz w:val="20"/>
-                <w:szCs w:val="20"/>
-              </w:rPr>
-              <w:t xml:space="preserve">Inserir os dados neste espaço. Orientações: este item pode ser apresentado como resultados parciais, ou resultados finais para projetos implementados, ou, ainda, resultados esperados para propostas de projetos. Descrever de forma objetiva de que modo o projeto espera modificar as condições inicialmente diagnosticadas no público-alvo envolvido. Trata-se de uma projeção dos impactos sociais esperados ou desejados, considerando que a extensão universitária busca estar atenta aos interesses e necessidades da maioria da população, buscando superar desigualdades, garantir diversidade, evitar exclusões, implementar o desenvolvimento regional e desenvolver políticas públicas. </w:t>
+                <w:sz w:val="20"/>
+                <w:szCs w:val="20"/>
+              </w:rPr>
+              <w:t>O projeto FecapWallet espera contribuir significativamente para a organização financeira dos estudantes da FECAP, oferecendo uma ferramenta digital prática, centralizada e acessível. Espera-se que o aplicativo auxilie os alunos no controle de pequenos gastos diários, como despesas com cantina, boletos, biblioteca e livraria, promovendo maior consciência e planejamento financeiro. Além disso, o app deve facilitar a rotina acadêmica ao reunir, em um único ambiente, diversas funcionalidades úteis para o dia a dia do estudante. Espera-se também um impacto positivo no comportamento dos usuários, com a adoção de hábitos mais organizados, autônomos e responsáveis, alinhados aos princípios da educação financeira e ao uso consciente da tecnologia. A longo prazo, o FecapWallet pode servir de modelo para outras instituições, reforçando o papel da tecnologia como agente transformador na educação e no desenvolvimento pessoal dos jovens universitários.</w:t>
             </w:r>
           </w:p>
         </w:tc>
@@ -2394,38 +3682,17 @@
               <w:jc w:val="both"/>
               <w:rPr>
                 <w:rFonts w:ascii="Arial" w:eastAsia="Arial" w:hAnsi="Arial" w:cs="Arial"/>
-                <w:color w:val="FF3333"/>
-                <w:sz w:val="20"/>
-                <w:szCs w:val="20"/>
-              </w:rPr>
-            </w:pPr>
-            <w:r>
-              <w:rPr>
-                <w:rFonts w:ascii="Arial" w:eastAsia="Arial" w:hAnsi="Arial" w:cs="Arial"/>
-                <w:color w:val="525252" w:themeColor="accent3" w:themeShade="80"/>
-                <w:sz w:val="20"/>
-                <w:szCs w:val="20"/>
-              </w:rPr>
-              <w:t>Inserir os dados neste espaço. Orientações:</w:t>
-            </w:r>
-            <w:r>
-              <w:rPr>
-                <w:rFonts w:ascii="Arial" w:eastAsia="Arial" w:hAnsi="Arial" w:cs="Arial"/>
-                <w:b/>
-                <w:color w:val="525252" w:themeColor="accent3" w:themeShade="80"/>
-                <w:sz w:val="16"/>
-                <w:szCs w:val="16"/>
-              </w:rPr>
-              <w:t xml:space="preserve"> </w:t>
-            </w:r>
-            <w:r>
-              <w:rPr>
-                <w:rFonts w:ascii="Arial" w:eastAsia="Arial" w:hAnsi="Arial" w:cs="Arial"/>
-                <w:color w:val="525252" w:themeColor="accent3" w:themeShade="80"/>
-                <w:sz w:val="20"/>
-                <w:szCs w:val="20"/>
-              </w:rPr>
-              <w:t>é o desfecho do projeto devendo responder o problema central do trabalho e destacar se o trabalho atendeu aos objetivos propostos, destacando os principais pontos e direções para futuras ações.</w:t>
+                <w:sz w:val="20"/>
+                <w:szCs w:val="20"/>
+              </w:rPr>
+            </w:pPr>
+            <w:r>
+              <w:rPr>
+                <w:rFonts w:ascii="Arial" w:eastAsia="Arial" w:hAnsi="Arial" w:cs="Arial"/>
+                <w:sz w:val="20"/>
+                <w:szCs w:val="20"/>
+              </w:rPr>
+              <w:t>O desenvolvimento do FecapWallet representa um avanço no apoio à gestão pessoal dos estudantes da FECAP. Além de promover a educação financeira, o aplicativo se destaca por centralizar informações relevantes em uma só ferramenta, facilitando a rotina dos alunos e reduzindo o tempo gasto com tarefas operacionais. O projeto cumpriu seus objetivos, apresenta potencial de expansão e reforça a importância de ações extensionistas voltadas à aplicação prática do conhecimento em benefício da comunidade acadêmica.</w:t>
             </w:r>
           </w:p>
         </w:tc>
@@ -2487,19 +3754,158 @@
               <w:spacing w:after="0" w:line="240" w:lineRule="auto"/>
               <w:rPr>
                 <w:rFonts w:ascii="Arial" w:eastAsia="Arial" w:hAnsi="Arial" w:cs="Arial"/>
-                <w:color w:val="1F4E79"/>
-                <w:sz w:val="20"/>
-                <w:szCs w:val="20"/>
-              </w:rPr>
-            </w:pPr>
-            <w:r>
-              <w:rPr>
-                <w:rFonts w:ascii="Arial" w:eastAsia="Arial" w:hAnsi="Arial" w:cs="Arial"/>
-                <w:color w:val="525252" w:themeColor="accent3" w:themeShade="80"/>
-                <w:sz w:val="20"/>
-                <w:szCs w:val="20"/>
-              </w:rPr>
-              <w:t>Inserir os dados neste espaço. Orientações: Adotar a versão atual da ABNT.</w:t>
+                <w:sz w:val="20"/>
+                <w:szCs w:val="20"/>
+              </w:rPr>
+            </w:pPr>
+            <w:r>
+              <w:rPr>
+                <w:rFonts w:ascii="Arial" w:eastAsia="Arial" w:hAnsi="Arial" w:cs="Arial"/>
+                <w:sz w:val="20"/>
+                <w:szCs w:val="20"/>
+              </w:rPr>
+              <w:t>NASCIMENTO, D. C. do; SOUZA, A. J. de. O uso da tecnologia na gestão pessoal e financeira de jovens universitários. Cadernos de Extensão Universitária, v. 4, n. 1, p. 120-133, 2022.</w:t>
+            </w:r>
+          </w:p>
+          <w:p>
+            <w:pPr>
+              <w:spacing w:after="0" w:line="240" w:lineRule="auto"/>
+              <w:rPr>
+                <w:rFonts w:ascii="Arial" w:eastAsia="Arial" w:hAnsi="Arial" w:cs="Arial"/>
+                <w:sz w:val="20"/>
+                <w:szCs w:val="20"/>
+              </w:rPr>
+            </w:pPr>
+          </w:p>
+          <w:p>
+            <w:pPr>
+              <w:spacing w:after="0" w:line="240" w:lineRule="auto"/>
+              <w:rPr>
+                <w:rFonts w:ascii="Arial" w:eastAsia="Arial" w:hAnsi="Arial" w:cs="Arial"/>
+                <w:sz w:val="20"/>
+                <w:szCs w:val="20"/>
+              </w:rPr>
+            </w:pPr>
+            <w:r>
+              <w:rPr>
+                <w:rFonts w:ascii="Arial" w:eastAsia="Arial" w:hAnsi="Arial" w:cs="Arial"/>
+                <w:sz w:val="20"/>
+                <w:szCs w:val="20"/>
+              </w:rPr>
+              <w:lastRenderedPageBreak/>
+              <w:t>SILVA, L. F.; OLIVEIRA, M. A. T. Aplicativos móveis como ferramentas de apoio à educação. Revista de Tecnologias Digitais na Educação, v. 10, n. 1, p. 54-67, 2021.</w:t>
+            </w:r>
+          </w:p>
+          <w:p>
+            <w:pPr>
+              <w:spacing w:after="0" w:line="240" w:lineRule="auto"/>
+              <w:rPr>
+                <w:rFonts w:ascii="Arial" w:eastAsia="Arial" w:hAnsi="Arial" w:cs="Arial"/>
+                <w:sz w:val="20"/>
+                <w:szCs w:val="20"/>
+              </w:rPr>
+            </w:pPr>
+          </w:p>
+          <w:p>
+            <w:pPr>
+              <w:spacing w:after="0" w:line="240" w:lineRule="auto"/>
+              <w:rPr>
+                <w:rFonts w:ascii="Arial" w:eastAsia="Arial" w:hAnsi="Arial" w:cs="Arial"/>
+                <w:sz w:val="20"/>
+                <w:szCs w:val="20"/>
+              </w:rPr>
+            </w:pPr>
+            <w:r>
+              <w:rPr>
+                <w:rFonts w:ascii="Arial" w:eastAsia="Arial" w:hAnsi="Arial" w:cs="Arial"/>
+                <w:sz w:val="20"/>
+                <w:szCs w:val="20"/>
+              </w:rPr>
+              <w:t>BANCO CENTRAL DO BRASIL. Cidadania Financeira: Educação Financeira. Brasília: Bacen, 2023. Disponível em: https://www.bcb.gov.br/cidadaniafinanceira. Acesso em: 18 maio 2025.</w:t>
+            </w:r>
+          </w:p>
+          <w:p>
+            <w:pPr>
+              <w:spacing w:after="0" w:line="240" w:lineRule="auto"/>
+              <w:rPr>
+                <w:rFonts w:ascii="Arial" w:eastAsia="Arial" w:hAnsi="Arial" w:cs="Arial"/>
+                <w:sz w:val="20"/>
+                <w:szCs w:val="20"/>
+              </w:rPr>
+            </w:pPr>
+          </w:p>
+          <w:p>
+            <w:pPr>
+              <w:spacing w:after="0" w:line="240" w:lineRule="auto"/>
+              <w:rPr>
+                <w:rFonts w:ascii="Arial" w:eastAsia="Arial" w:hAnsi="Arial" w:cs="Arial"/>
+                <w:sz w:val="20"/>
+                <w:szCs w:val="20"/>
+              </w:rPr>
+            </w:pPr>
+            <w:r>
+              <w:rPr>
+                <w:rFonts w:ascii="Arial" w:eastAsia="Arial" w:hAnsi="Arial" w:cs="Arial"/>
+                <w:sz w:val="20"/>
+                <w:szCs w:val="20"/>
+              </w:rPr>
+              <w:t>GITMAN, Lawrence J.; JOEHNK, Michael D. Personal Financial Planning. 10. ed. Mason: South-Western Cengage Learning, 2004.</w:t>
+            </w:r>
+          </w:p>
+          <w:p>
+            <w:pPr>
+              <w:spacing w:after="0" w:line="240" w:lineRule="auto"/>
+              <w:rPr>
+                <w:rFonts w:ascii="Arial" w:eastAsia="Arial" w:hAnsi="Arial" w:cs="Arial"/>
+                <w:sz w:val="20"/>
+                <w:szCs w:val="20"/>
+              </w:rPr>
+            </w:pPr>
+          </w:p>
+          <w:p>
+            <w:pPr>
+              <w:spacing w:after="0" w:line="240" w:lineRule="auto"/>
+              <w:rPr>
+                <w:rFonts w:ascii="Arial" w:eastAsia="Arial" w:hAnsi="Arial" w:cs="Arial"/>
+                <w:sz w:val="20"/>
+                <w:szCs w:val="20"/>
+              </w:rPr>
+            </w:pPr>
+            <w:r>
+              <w:rPr>
+                <w:rFonts w:ascii="Arial" w:eastAsia="Arial" w:hAnsi="Arial" w:cs="Arial"/>
+                <w:sz w:val="20"/>
+                <w:szCs w:val="20"/>
+              </w:rPr>
+              <w:t>ONU – Organização das Nações Unidas. Objetivos de Desenvolvimento Sustentável. Disponível em: https://brasil.un.org/pt-br/sdgs</w:t>
+            </w:r>
+          </w:p>
+          <w:p>
+            <w:pPr>
+              <w:spacing w:after="0" w:line="240" w:lineRule="auto"/>
+              <w:rPr>
+                <w:rFonts w:ascii="Arial" w:eastAsia="Arial" w:hAnsi="Arial" w:cs="Arial"/>
+                <w:sz w:val="20"/>
+                <w:szCs w:val="20"/>
+              </w:rPr>
+            </w:pPr>
+          </w:p>
+          <w:p>
+            <w:pPr>
+              <w:spacing w:after="0" w:line="240" w:lineRule="auto"/>
+              <w:rPr>
+                <w:rFonts w:ascii="Arial" w:eastAsia="Arial" w:hAnsi="Arial" w:cs="Arial"/>
+                <w:sz w:val="20"/>
+                <w:szCs w:val="20"/>
+              </w:rPr>
+            </w:pPr>
+            <w:r>
+              <w:rPr>
+                <w:rFonts w:ascii="Arial" w:eastAsia="Arial" w:hAnsi="Arial" w:cs="Arial"/>
+                <w:sz w:val="20"/>
+                <w:szCs w:val="20"/>
+              </w:rPr>
+              <w:t>SANDRONI, Paulo. Dicionário de Economia do Século XXI. São Paulo: Record, 2007.</w:t>
             </w:r>
           </w:p>
         </w:tc>
@@ -2640,7 +4046,6 @@
             <w:r>
               <w:rPr>
                 <w:rFonts w:ascii="Arial" w:eastAsia="Arial" w:hAnsi="Arial" w:cs="Arial"/>
-                <w:color w:val="525252" w:themeColor="accent3" w:themeShade="80"/>
                 <w:sz w:val="20"/>
                 <w:szCs w:val="20"/>
                 <w:highlight w:val="white"/>
@@ -2793,7 +4198,6 @@
                 <w:sz w:val="20"/>
                 <w:szCs w:val="20"/>
               </w:rPr>
-              <w:lastRenderedPageBreak/>
               <w:t>Documentos FECAP</w:t>
             </w:r>
           </w:p>
@@ -2882,12 +4286,7 @@
       </w:r>
     </w:p>
     <w:sectPr>
-      <w:headerReference w:type="even" r:id="rId10"/>
-      <w:headerReference w:type="default" r:id="rId11"/>
-      <w:footerReference w:type="even" r:id="rId12"/>
-      <w:footerReference w:type="default" r:id="rId13"/>
-      <w:headerReference w:type="first" r:id="rId14"/>
-      <w:footerReference w:type="first" r:id="rId15"/>
+      <w:headerReference w:type="default" r:id="rId26"/>
       <w:pgSz w:w="11906" w:h="16838"/>
       <w:pgMar w:top="1985" w:right="991" w:bottom="1560" w:left="1701" w:header="708" w:footer="708" w:gutter="0"/>
       <w:cols w:space="708"/>
@@ -2922,36 +4321,6 @@
 </w:endnotes>
 </file>
 
-<file path=word/footer1.xml><?xml version="1.0" encoding="utf-8"?>
-<w:ftr xmlns:wpc="http://schemas.microsoft.com/office/word/2010/wordprocessingCanvas" xmlns:cx="http://schemas.microsoft.com/office/drawing/2014/chartex" xmlns:cx1="http://schemas.microsoft.com/office/drawing/2015/9/8/chartex" xmlns:cx2="http://schemas.microsoft.com/office/drawing/2015/10/21/chartex" xmlns:cx3="http://schemas.microsoft.com/office/drawing/2016/5/9/chartex" xmlns:cx4="http://schemas.microsoft.com/office/drawing/2016/5/10/chartex" xmlns:cx5="http://schemas.microsoft.com/office/drawing/2016/5/11/chartex" xmlns:cx6="http://schemas.microsoft.com/office/drawing/2016/5/12/chartex" xmlns:cx7="http://schemas.microsoft.com/office/drawing/2016/5/13/chartex" xmlns:cx8="http://schemas.microsoft.com/office/drawing/2016/5/14/chartex" xmlns:mc="http://schemas.openxmlformats.org/markup-compatibility/2006" xmlns:aink="http://schemas.microsoft.com/office/drawing/2016/ink" xmlns:am3d="http://schemas.microsoft.com/office/drawing/2017/model3d" xmlns:o="urn:schemas-microsoft-com:office:office" xmlns:oel="http://schemas.microsoft.com/office/2019/extlst" xmlns:r="http://schemas.openxmlformats.org/officeDocument/2006/relationships" xmlns:m="http://schemas.openxmlformats.org/officeDocument/2006/math" xmlns:v="urn:schemas-microsoft-com:vml" xmlns:wp14="http://schemas.microsoft.com/office/word/2010/wordprocessingDrawing" xmlns:wp="http://schemas.openxmlformats.org/drawingml/2006/wordprocessingDrawing" xmlns:w10="urn:schemas-microsoft-com:office:word" xmlns:w="http://schemas.openxmlformats.org/wordprocessingml/2006/main" xmlns:w14="http://schemas.microsoft.com/office/word/2010/wordml" xmlns:w15="http://schemas.microsoft.com/office/word/2012/wordml" xmlns:w16cex="http://schemas.microsoft.com/office/word/2018/wordml/cex" xmlns:w16cid="http://schemas.microsoft.com/office/word/2016/wordml/cid" xmlns:w16="http://schemas.microsoft.com/office/word/2018/wordml" xmlns:w16du="http://schemas.microsoft.com/office/word/2023/wordml/word16du" xmlns:w16sdtdh="http://schemas.microsoft.com/office/word/2020/wordml/sdtdatahash" xmlns:w16sdtfl="http://schemas.microsoft.com/office/word/2024/wordml/sdtformatlock" xmlns:w16se="http://schemas.microsoft.com/office/word/2015/wordml/symex" xmlns:wpg="http://schemas.microsoft.com/office/word/2010/wordprocessingGroup" xmlns:wpi="http://schemas.microsoft.com/office/word/2010/wordprocessingInk" xmlns:wne="http://schemas.microsoft.com/office/word/2006/wordml" xmlns:wps="http://schemas.microsoft.com/office/word/2010/wordprocessingShape" mc:Ignorable="w14 w15 w16se w16cid w16 w16cex w16sdtdh w16sdtfl w16du wp14">
-  <w:p>
-    <w:pPr>
-      <w:pStyle w:val="Rodap"/>
-    </w:pPr>
-  </w:p>
-</w:ftr>
-</file>
-
-<file path=word/footer2.xml><?xml version="1.0" encoding="utf-8"?>
-<w:ftr xmlns:wpc="http://schemas.microsoft.com/office/word/2010/wordprocessingCanvas" xmlns:cx="http://schemas.microsoft.com/office/drawing/2014/chartex" xmlns:cx1="http://schemas.microsoft.com/office/drawing/2015/9/8/chartex" xmlns:cx2="http://schemas.microsoft.com/office/drawing/2015/10/21/chartex" xmlns:cx3="http://schemas.microsoft.com/office/drawing/2016/5/9/chartex" xmlns:cx4="http://schemas.microsoft.com/office/drawing/2016/5/10/chartex" xmlns:cx5="http://schemas.microsoft.com/office/drawing/2016/5/11/chartex" xmlns:cx6="http://schemas.microsoft.com/office/drawing/2016/5/12/chartex" xmlns:cx7="http://schemas.microsoft.com/office/drawing/2016/5/13/chartex" xmlns:cx8="http://schemas.microsoft.com/office/drawing/2016/5/14/chartex" xmlns:mc="http://schemas.openxmlformats.org/markup-compatibility/2006" xmlns:aink="http://schemas.microsoft.com/office/drawing/2016/ink" xmlns:am3d="http://schemas.microsoft.com/office/drawing/2017/model3d" xmlns:o="urn:schemas-microsoft-com:office:office" xmlns:oel="http://schemas.microsoft.com/office/2019/extlst" xmlns:r="http://schemas.openxmlformats.org/officeDocument/2006/relationships" xmlns:m="http://schemas.openxmlformats.org/officeDocument/2006/math" xmlns:v="urn:schemas-microsoft-com:vml" xmlns:wp14="http://schemas.microsoft.com/office/word/2010/wordprocessingDrawing" xmlns:wp="http://schemas.openxmlformats.org/drawingml/2006/wordprocessingDrawing" xmlns:w10="urn:schemas-microsoft-com:office:word" xmlns:w="http://schemas.openxmlformats.org/wordprocessingml/2006/main" xmlns:w14="http://schemas.microsoft.com/office/word/2010/wordml" xmlns:w15="http://schemas.microsoft.com/office/word/2012/wordml" xmlns:w16cex="http://schemas.microsoft.com/office/word/2018/wordml/cex" xmlns:w16cid="http://schemas.microsoft.com/office/word/2016/wordml/cid" xmlns:w16="http://schemas.microsoft.com/office/word/2018/wordml" xmlns:w16du="http://schemas.microsoft.com/office/word/2023/wordml/word16du" xmlns:w16sdtdh="http://schemas.microsoft.com/office/word/2020/wordml/sdtdatahash" xmlns:w16sdtfl="http://schemas.microsoft.com/office/word/2024/wordml/sdtformatlock" xmlns:w16se="http://schemas.microsoft.com/office/word/2015/wordml/symex" xmlns:wpg="http://schemas.microsoft.com/office/word/2010/wordprocessingGroup" xmlns:wpi="http://schemas.microsoft.com/office/word/2010/wordprocessingInk" xmlns:wne="http://schemas.microsoft.com/office/word/2006/wordml" xmlns:wps="http://schemas.microsoft.com/office/word/2010/wordprocessingShape" mc:Ignorable="w14 w15 w16se w16cid w16 w16cex w16sdtdh w16sdtfl w16du wp14">
-  <w:p>
-    <w:pPr>
-      <w:pStyle w:val="Rodap"/>
-    </w:pPr>
-  </w:p>
-</w:ftr>
-</file>
-
-<file path=word/footer3.xml><?xml version="1.0" encoding="utf-8"?>
-<w:ftr xmlns:wpc="http://schemas.microsoft.com/office/word/2010/wordprocessingCanvas" xmlns:cx="http://schemas.microsoft.com/office/drawing/2014/chartex" xmlns:cx1="http://schemas.microsoft.com/office/drawing/2015/9/8/chartex" xmlns:cx2="http://schemas.microsoft.com/office/drawing/2015/10/21/chartex" xmlns:cx3="http://schemas.microsoft.com/office/drawing/2016/5/9/chartex" xmlns:cx4="http://schemas.microsoft.com/office/drawing/2016/5/10/chartex" xmlns:cx5="http://schemas.microsoft.com/office/drawing/2016/5/11/chartex" xmlns:cx6="http://schemas.microsoft.com/office/drawing/2016/5/12/chartex" xmlns:cx7="http://schemas.microsoft.com/office/drawing/2016/5/13/chartex" xmlns:cx8="http://schemas.microsoft.com/office/drawing/2016/5/14/chartex" xmlns:mc="http://schemas.openxmlformats.org/markup-compatibility/2006" xmlns:aink="http://schemas.microsoft.com/office/drawing/2016/ink" xmlns:am3d="http://schemas.microsoft.com/office/drawing/2017/model3d" xmlns:o="urn:schemas-microsoft-com:office:office" xmlns:oel="http://schemas.microsoft.com/office/2019/extlst" xmlns:r="http://schemas.openxmlformats.org/officeDocument/2006/relationships" xmlns:m="http://schemas.openxmlformats.org/officeDocument/2006/math" xmlns:v="urn:schemas-microsoft-com:vml" xmlns:wp14="http://schemas.microsoft.com/office/word/2010/wordprocessingDrawing" xmlns:wp="http://schemas.openxmlformats.org/drawingml/2006/wordprocessingDrawing" xmlns:w10="urn:schemas-microsoft-com:office:word" xmlns:w="http://schemas.openxmlformats.org/wordprocessingml/2006/main" xmlns:w14="http://schemas.microsoft.com/office/word/2010/wordml" xmlns:w15="http://schemas.microsoft.com/office/word/2012/wordml" xmlns:w16cex="http://schemas.microsoft.com/office/word/2018/wordml/cex" xmlns:w16cid="http://schemas.microsoft.com/office/word/2016/wordml/cid" xmlns:w16="http://schemas.microsoft.com/office/word/2018/wordml" xmlns:w16du="http://schemas.microsoft.com/office/word/2023/wordml/word16du" xmlns:w16sdtdh="http://schemas.microsoft.com/office/word/2020/wordml/sdtdatahash" xmlns:w16sdtfl="http://schemas.microsoft.com/office/word/2024/wordml/sdtformatlock" xmlns:w16se="http://schemas.microsoft.com/office/word/2015/wordml/symex" xmlns:wpg="http://schemas.microsoft.com/office/word/2010/wordprocessingGroup" xmlns:wpi="http://schemas.microsoft.com/office/word/2010/wordprocessingInk" xmlns:wne="http://schemas.microsoft.com/office/word/2006/wordml" xmlns:wps="http://schemas.microsoft.com/office/word/2010/wordprocessingShape" mc:Ignorable="w14 w15 w16se w16cid w16 w16cex w16sdtdh w16sdtfl w16du wp14">
-  <w:p>
-    <w:pPr>
-      <w:pStyle w:val="Rodap"/>
-    </w:pPr>
-  </w:p>
-</w:ftr>
-</file>
-
 <file path=word/footnotes.xml><?xml version="1.0" encoding="utf-8"?>
 <w:footnotes xmlns:wpc="http://schemas.microsoft.com/office/word/2010/wordprocessingCanvas" xmlns:cx="http://schemas.microsoft.com/office/drawing/2014/chartex" xmlns:cx1="http://schemas.microsoft.com/office/drawing/2015/9/8/chartex" xmlns:cx2="http://schemas.microsoft.com/office/drawing/2015/10/21/chartex" xmlns:cx3="http://schemas.microsoft.com/office/drawing/2016/5/9/chartex" xmlns:cx4="http://schemas.microsoft.com/office/drawing/2016/5/10/chartex" xmlns:cx5="http://schemas.microsoft.com/office/drawing/2016/5/11/chartex" xmlns:cx6="http://schemas.microsoft.com/office/drawing/2016/5/12/chartex" xmlns:cx7="http://schemas.microsoft.com/office/drawing/2016/5/13/chartex" xmlns:cx8="http://schemas.microsoft.com/office/drawing/2016/5/14/chartex" xmlns:mc="http://schemas.openxmlformats.org/markup-compatibility/2006" xmlns:aink="http://schemas.microsoft.com/office/drawing/2016/ink" xmlns:am3d="http://schemas.microsoft.com/office/drawing/2017/model3d" xmlns:o="urn:schemas-microsoft-com:office:office" xmlns:oel="http://schemas.microsoft.com/office/2019/extlst" xmlns:r="http://schemas.openxmlformats.org/officeDocument/2006/relationships" xmlns:m="http://schemas.openxmlformats.org/officeDocument/2006/math" xmlns:v="urn:schemas-microsoft-com:vml" xmlns:wp14="http://schemas.microsoft.com/office/word/2010/wordprocessingDrawing" xmlns:wp="http://schemas.openxmlformats.org/drawingml/2006/wordprocessingDrawing" xmlns:w10="urn:schemas-microsoft-com:office:word" xmlns:w="http://schemas.openxmlformats.org/wordprocessingml/2006/main" xmlns:w14="http://schemas.microsoft.com/office/word/2010/wordml" xmlns:w15="http://schemas.microsoft.com/office/word/2012/wordml" xmlns:w16cex="http://schemas.microsoft.com/office/word/2018/wordml/cex" xmlns:w16cid="http://schemas.microsoft.com/office/word/2016/wordml/cid" xmlns:w16="http://schemas.microsoft.com/office/word/2018/wordml" xmlns:w16du="http://schemas.microsoft.com/office/word/2023/wordml/word16du" xmlns:w16sdtdh="http://schemas.microsoft.com/office/word/2020/wordml/sdtdatahash" xmlns:w16sdtfl="http://schemas.microsoft.com/office/word/2024/wordml/sdtformatlock" xmlns:w16se="http://schemas.microsoft.com/office/word/2015/wordml/symex" xmlns:wpg="http://schemas.microsoft.com/office/word/2010/wordprocessingGroup" xmlns:wpi="http://schemas.microsoft.com/office/word/2010/wordprocessingInk" xmlns:wne="http://schemas.microsoft.com/office/word/2006/wordml" xmlns:wps="http://schemas.microsoft.com/office/word/2010/wordprocessingShape" mc:Ignorable="w14 w15 w16se w16cid w16 w16cex w16sdtdh w16sdtfl w16du wp14">
   <w:footnote w:type="separator" w:id="-1">
@@ -2978,16 +4347,6 @@
 </file>
 
 <file path=word/header1.xml><?xml version="1.0" encoding="utf-8"?>
-<w:hdr xmlns:wpc="http://schemas.microsoft.com/office/word/2010/wordprocessingCanvas" xmlns:cx="http://schemas.microsoft.com/office/drawing/2014/chartex" xmlns:cx1="http://schemas.microsoft.com/office/drawing/2015/9/8/chartex" xmlns:cx2="http://schemas.microsoft.com/office/drawing/2015/10/21/chartex" xmlns:cx3="http://schemas.microsoft.com/office/drawing/2016/5/9/chartex" xmlns:cx4="http://schemas.microsoft.com/office/drawing/2016/5/10/chartex" xmlns:cx5="http://schemas.microsoft.com/office/drawing/2016/5/11/chartex" xmlns:cx6="http://schemas.microsoft.com/office/drawing/2016/5/12/chartex" xmlns:cx7="http://schemas.microsoft.com/office/drawing/2016/5/13/chartex" xmlns:cx8="http://schemas.microsoft.com/office/drawing/2016/5/14/chartex" xmlns:mc="http://schemas.openxmlformats.org/markup-compatibility/2006" xmlns:aink="http://schemas.microsoft.com/office/drawing/2016/ink" xmlns:am3d="http://schemas.microsoft.com/office/drawing/2017/model3d" xmlns:o="urn:schemas-microsoft-com:office:office" xmlns:oel="http://schemas.microsoft.com/office/2019/extlst" xmlns:r="http://schemas.openxmlformats.org/officeDocument/2006/relationships" xmlns:m="http://schemas.openxmlformats.org/officeDocument/2006/math" xmlns:v="urn:schemas-microsoft-com:vml" xmlns:wp14="http://schemas.microsoft.com/office/word/2010/wordprocessingDrawing" xmlns:wp="http://schemas.openxmlformats.org/drawingml/2006/wordprocessingDrawing" xmlns:w10="urn:schemas-microsoft-com:office:word" xmlns:w="http://schemas.openxmlformats.org/wordprocessingml/2006/main" xmlns:w14="http://schemas.microsoft.com/office/word/2010/wordml" xmlns:w15="http://schemas.microsoft.com/office/word/2012/wordml" xmlns:w16cex="http://schemas.microsoft.com/office/word/2018/wordml/cex" xmlns:w16cid="http://schemas.microsoft.com/office/word/2016/wordml/cid" xmlns:w16="http://schemas.microsoft.com/office/word/2018/wordml" xmlns:w16du="http://schemas.microsoft.com/office/word/2023/wordml/word16du" xmlns:w16sdtdh="http://schemas.microsoft.com/office/word/2020/wordml/sdtdatahash" xmlns:w16sdtfl="http://schemas.microsoft.com/office/word/2024/wordml/sdtformatlock" xmlns:w16se="http://schemas.microsoft.com/office/word/2015/wordml/symex" xmlns:wpg="http://schemas.microsoft.com/office/word/2010/wordprocessingGroup" xmlns:wpi="http://schemas.microsoft.com/office/word/2010/wordprocessingInk" xmlns:wne="http://schemas.microsoft.com/office/word/2006/wordml" xmlns:wps="http://schemas.microsoft.com/office/word/2010/wordprocessingShape" mc:Ignorable="w14 w15 w16se w16cid w16 w16cex w16sdtdh w16sdtfl w16du wp14">
-  <w:p>
-    <w:pPr>
-      <w:pStyle w:val="Cabealho"/>
-    </w:pPr>
-  </w:p>
-</w:hdr>
-</file>
-
-<file path=word/header2.xml><?xml version="1.0" encoding="utf-8"?>
 <w:hdr xmlns:wpc="http://schemas.microsoft.com/office/word/2010/wordprocessingCanvas" xmlns:cx="http://schemas.microsoft.com/office/drawing/2014/chartex" xmlns:cx1="http://schemas.microsoft.com/office/drawing/2015/9/8/chartex" xmlns:cx2="http://schemas.microsoft.com/office/drawing/2015/10/21/chartex" xmlns:cx3="http://schemas.microsoft.com/office/drawing/2016/5/9/chartex" xmlns:cx4="http://schemas.microsoft.com/office/drawing/2016/5/10/chartex" xmlns:cx5="http://schemas.microsoft.com/office/drawing/2016/5/11/chartex" xmlns:cx6="http://schemas.microsoft.com/office/drawing/2016/5/12/chartex" xmlns:cx7="http://schemas.microsoft.com/office/drawing/2016/5/13/chartex" xmlns:cx8="http://schemas.microsoft.com/office/drawing/2016/5/14/chartex" xmlns:mc="http://schemas.openxmlformats.org/markup-compatibility/2006" xmlns:aink="http://schemas.microsoft.com/office/drawing/2016/ink" xmlns:am3d="http://schemas.microsoft.com/office/drawing/2017/model3d" xmlns:o="urn:schemas-microsoft-com:office:office" xmlns:oel="http://schemas.microsoft.com/office/2019/extlst" xmlns:r="http://schemas.openxmlformats.org/officeDocument/2006/relationships" xmlns:m="http://schemas.openxmlformats.org/officeDocument/2006/math" xmlns:v="urn:schemas-microsoft-com:vml" xmlns:wp14="http://schemas.microsoft.com/office/word/2010/wordprocessingDrawing" xmlns:wp="http://schemas.openxmlformats.org/drawingml/2006/wordprocessingDrawing" xmlns:w10="urn:schemas-microsoft-com:office:word" xmlns:w="http://schemas.openxmlformats.org/wordprocessingml/2006/main" xmlns:w14="http://schemas.microsoft.com/office/word/2010/wordml" xmlns:w15="http://schemas.microsoft.com/office/word/2012/wordml" xmlns:w16cex="http://schemas.microsoft.com/office/word/2018/wordml/cex" xmlns:w16cid="http://schemas.microsoft.com/office/word/2016/wordml/cid" xmlns:w16="http://schemas.microsoft.com/office/word/2018/wordml" xmlns:w16du="http://schemas.microsoft.com/office/word/2023/wordml/word16du" xmlns:w16sdtdh="http://schemas.microsoft.com/office/word/2020/wordml/sdtdatahash" xmlns:w16sdtfl="http://schemas.microsoft.com/office/word/2024/wordml/sdtformatlock" xmlns:w16se="http://schemas.microsoft.com/office/word/2015/wordml/symex" xmlns:wpg="http://schemas.microsoft.com/office/word/2010/wordprocessingGroup" xmlns:wpi="http://schemas.microsoft.com/office/word/2010/wordprocessingInk" xmlns:wne="http://schemas.microsoft.com/office/word/2006/wordml" xmlns:wps="http://schemas.microsoft.com/office/word/2010/wordprocessingShape" mc:Ignorable="w14 w15 w16se w16cid w16 w16cex w16sdtdh w16sdtfl w16du wp14">
   <w:p>
     <w:pPr>
@@ -3057,16 +4416,6 @@
 </w:hdr>
 </file>
 
-<file path=word/header3.xml><?xml version="1.0" encoding="utf-8"?>
-<w:hdr xmlns:wpc="http://schemas.microsoft.com/office/word/2010/wordprocessingCanvas" xmlns:cx="http://schemas.microsoft.com/office/drawing/2014/chartex" xmlns:cx1="http://schemas.microsoft.com/office/drawing/2015/9/8/chartex" xmlns:cx2="http://schemas.microsoft.com/office/drawing/2015/10/21/chartex" xmlns:cx3="http://schemas.microsoft.com/office/drawing/2016/5/9/chartex" xmlns:cx4="http://schemas.microsoft.com/office/drawing/2016/5/10/chartex" xmlns:cx5="http://schemas.microsoft.com/office/drawing/2016/5/11/chartex" xmlns:cx6="http://schemas.microsoft.com/office/drawing/2016/5/12/chartex" xmlns:cx7="http://schemas.microsoft.com/office/drawing/2016/5/13/chartex" xmlns:cx8="http://schemas.microsoft.com/office/drawing/2016/5/14/chartex" xmlns:mc="http://schemas.openxmlformats.org/markup-compatibility/2006" xmlns:aink="http://schemas.microsoft.com/office/drawing/2016/ink" xmlns:am3d="http://schemas.microsoft.com/office/drawing/2017/model3d" xmlns:o="urn:schemas-microsoft-com:office:office" xmlns:oel="http://schemas.microsoft.com/office/2019/extlst" xmlns:r="http://schemas.openxmlformats.org/officeDocument/2006/relationships" xmlns:m="http://schemas.openxmlformats.org/officeDocument/2006/math" xmlns:v="urn:schemas-microsoft-com:vml" xmlns:wp14="http://schemas.microsoft.com/office/word/2010/wordprocessingDrawing" xmlns:wp="http://schemas.openxmlformats.org/drawingml/2006/wordprocessingDrawing" xmlns:w10="urn:schemas-microsoft-com:office:word" xmlns:w="http://schemas.openxmlformats.org/wordprocessingml/2006/main" xmlns:w14="http://schemas.microsoft.com/office/word/2010/wordml" xmlns:w15="http://schemas.microsoft.com/office/word/2012/wordml" xmlns:w16cex="http://schemas.microsoft.com/office/word/2018/wordml/cex" xmlns:w16cid="http://schemas.microsoft.com/office/word/2016/wordml/cid" xmlns:w16="http://schemas.microsoft.com/office/word/2018/wordml" xmlns:w16du="http://schemas.microsoft.com/office/word/2023/wordml/word16du" xmlns:w16sdtdh="http://schemas.microsoft.com/office/word/2020/wordml/sdtdatahash" xmlns:w16sdtfl="http://schemas.microsoft.com/office/word/2024/wordml/sdtformatlock" xmlns:w16se="http://schemas.microsoft.com/office/word/2015/wordml/symex" xmlns:wpg="http://schemas.microsoft.com/office/word/2010/wordprocessingGroup" xmlns:wpi="http://schemas.microsoft.com/office/word/2010/wordprocessingInk" xmlns:wne="http://schemas.microsoft.com/office/word/2006/wordml" xmlns:wps="http://schemas.microsoft.com/office/word/2010/wordprocessingShape" mc:Ignorable="w14 w15 w16se w16cid w16 w16cex w16sdtdh w16sdtfl w16du wp14">
-  <w:p>
-    <w:pPr>
-      <w:pStyle w:val="Cabealho"/>
-    </w:pPr>
-  </w:p>
-</w:hdr>
-</file>
-
 <file path=word/numbering.xml><?xml version="1.0" encoding="utf-8"?>
 <w:numbering xmlns:wpc="http://schemas.microsoft.com/office/word/2010/wordprocessingCanvas" xmlns:cx="http://schemas.microsoft.com/office/drawing/2014/chartex" xmlns:cx1="http://schemas.microsoft.com/office/drawing/2015/9/8/chartex" xmlns:cx2="http://schemas.microsoft.com/office/drawing/2015/10/21/chartex" xmlns:cx3="http://schemas.microsoft.com/office/drawing/2016/5/9/chartex" xmlns:cx4="http://schemas.microsoft.com/office/drawing/2016/5/10/chartex" xmlns:cx5="http://schemas.microsoft.com/office/drawing/2016/5/11/chartex" xmlns:cx6="http://schemas.microsoft.com/office/drawing/2016/5/12/chartex" xmlns:cx7="http://schemas.microsoft.com/office/drawing/2016/5/13/chartex" xmlns:cx8="http://schemas.microsoft.com/office/drawing/2016/5/14/chartex" xmlns:mc="http://schemas.openxmlformats.org/markup-compatibility/2006" xmlns:aink="http://schemas.microsoft.com/office/drawing/2016/ink" xmlns:am3d="http://schemas.microsoft.com/office/drawing/2017/model3d" xmlns:o="urn:schemas-microsoft-com:office:office" xmlns:oel="http://schemas.microsoft.com/office/2019/extlst" xmlns:r="http://schemas.openxmlformats.org/officeDocument/2006/relationships" xmlns:m="http://schemas.openxmlformats.org/officeDocument/2006/math" xmlns:v="urn:schemas-microsoft-com:vml" xmlns:wp14="http://schemas.microsoft.com/office/word/2010/wordprocessingDrawing" xmlns:wp="http://schemas.openxmlformats.org/drawingml/2006/wordprocessingDrawing" xmlns:w10="urn:schemas-microsoft-com:office:word" xmlns:w="http://schemas.openxmlformats.org/wordprocessingml/2006/main" xmlns:w14="http://schemas.microsoft.com/office/word/2010/wordml" xmlns:w15="http://schemas.microsoft.com/office/word/2012/wordml" xmlns:w16cex="http://schemas.microsoft.com/office/word/2018/wordml/cex" xmlns:w16cid="http://schemas.microsoft.com/office/word/2016/wordml/cid" xmlns:w16="http://schemas.microsoft.com/office/word/2018/wordml" xmlns:w16du="http://schemas.microsoft.com/office/word/2023/wordml/word16du" xmlns:w16sdtdh="http://schemas.microsoft.com/office/word/2020/wordml/sdtdatahash" xmlns:w16sdtfl="http://schemas.microsoft.com/office/word/2024/wordml/sdtformatlock" xmlns:w16se="http://schemas.microsoft.com/office/word/2015/wordml/symex" xmlns:wpg="http://schemas.microsoft.com/office/word/2010/wordprocessingGroup" xmlns:wpi="http://schemas.microsoft.com/office/word/2010/wordprocessingInk" xmlns:wne="http://schemas.microsoft.com/office/word/2006/wordml" xmlns:wps="http://schemas.microsoft.com/office/word/2010/wordprocessingShape" mc:Ignorable="w14 w15 w16se w16cid w16 w16cex w16sdtdh w16sdtfl w16du wp14">
   <w:abstractNum w:abstractNumId="0" w15:restartNumberingAfterBreak="0">
@@ -3155,8 +4504,276 @@
       </w:pPr>
     </w:lvl>
   </w:abstractNum>
+  <w:abstractNum w:abstractNumId="1" w15:restartNumberingAfterBreak="0">
+    <w:nsid w:val="27B325A2"/>
+    <w:multiLevelType w:val="multilevel"/>
+    <w:tmpl w:val="E8BE57A2"/>
+    <w:lvl w:ilvl="0">
+      <w:start w:val="1"/>
+      <w:numFmt w:val="bullet"/>
+      <w:lvlText w:val=""/>
+      <w:lvlJc w:val="left"/>
+      <w:pPr>
+        <w:tabs>
+          <w:tab w:val="num" w:pos="720"/>
+        </w:tabs>
+        <w:ind w:left="720" w:hanging="360"/>
+      </w:pPr>
+      <w:rPr>
+        <w:rFonts w:ascii="Symbol" w:hAnsi="Symbol" w:hint="default"/>
+        <w:sz w:val="20"/>
+      </w:rPr>
+    </w:lvl>
+    <w:lvl w:ilvl="1" w:tentative="1">
+      <w:start w:val="1"/>
+      <w:numFmt w:val="bullet"/>
+      <w:lvlText w:val="o"/>
+      <w:lvlJc w:val="left"/>
+      <w:pPr>
+        <w:tabs>
+          <w:tab w:val="num" w:pos="1440"/>
+        </w:tabs>
+        <w:ind w:left="1440" w:hanging="360"/>
+      </w:pPr>
+      <w:rPr>
+        <w:rFonts w:ascii="Courier New" w:hAnsi="Courier New" w:hint="default"/>
+        <w:sz w:val="20"/>
+      </w:rPr>
+    </w:lvl>
+    <w:lvl w:ilvl="2" w:tentative="1">
+      <w:start w:val="1"/>
+      <w:numFmt w:val="bullet"/>
+      <w:lvlText w:val=""/>
+      <w:lvlJc w:val="left"/>
+      <w:pPr>
+        <w:tabs>
+          <w:tab w:val="num" w:pos="2160"/>
+        </w:tabs>
+        <w:ind w:left="2160" w:hanging="360"/>
+      </w:pPr>
+      <w:rPr>
+        <w:rFonts w:ascii="Wingdings" w:hAnsi="Wingdings" w:hint="default"/>
+        <w:sz w:val="20"/>
+      </w:rPr>
+    </w:lvl>
+    <w:lvl w:ilvl="3" w:tentative="1">
+      <w:start w:val="1"/>
+      <w:numFmt w:val="bullet"/>
+      <w:lvlText w:val=""/>
+      <w:lvlJc w:val="left"/>
+      <w:pPr>
+        <w:tabs>
+          <w:tab w:val="num" w:pos="2880"/>
+        </w:tabs>
+        <w:ind w:left="2880" w:hanging="360"/>
+      </w:pPr>
+      <w:rPr>
+        <w:rFonts w:ascii="Wingdings" w:hAnsi="Wingdings" w:hint="default"/>
+        <w:sz w:val="20"/>
+      </w:rPr>
+    </w:lvl>
+    <w:lvl w:ilvl="4" w:tentative="1">
+      <w:start w:val="1"/>
+      <w:numFmt w:val="bullet"/>
+      <w:lvlText w:val=""/>
+      <w:lvlJc w:val="left"/>
+      <w:pPr>
+        <w:tabs>
+          <w:tab w:val="num" w:pos="3600"/>
+        </w:tabs>
+        <w:ind w:left="3600" w:hanging="360"/>
+      </w:pPr>
+      <w:rPr>
+        <w:rFonts w:ascii="Wingdings" w:hAnsi="Wingdings" w:hint="default"/>
+        <w:sz w:val="20"/>
+      </w:rPr>
+    </w:lvl>
+    <w:lvl w:ilvl="5" w:tentative="1">
+      <w:start w:val="1"/>
+      <w:numFmt w:val="bullet"/>
+      <w:lvlText w:val=""/>
+      <w:lvlJc w:val="left"/>
+      <w:pPr>
+        <w:tabs>
+          <w:tab w:val="num" w:pos="4320"/>
+        </w:tabs>
+        <w:ind w:left="4320" w:hanging="360"/>
+      </w:pPr>
+      <w:rPr>
+        <w:rFonts w:ascii="Wingdings" w:hAnsi="Wingdings" w:hint="default"/>
+        <w:sz w:val="20"/>
+      </w:rPr>
+    </w:lvl>
+    <w:lvl w:ilvl="6" w:tentative="1">
+      <w:start w:val="1"/>
+      <w:numFmt w:val="bullet"/>
+      <w:lvlText w:val=""/>
+      <w:lvlJc w:val="left"/>
+      <w:pPr>
+        <w:tabs>
+          <w:tab w:val="num" w:pos="5040"/>
+        </w:tabs>
+        <w:ind w:left="5040" w:hanging="360"/>
+      </w:pPr>
+      <w:rPr>
+        <w:rFonts w:ascii="Wingdings" w:hAnsi="Wingdings" w:hint="default"/>
+        <w:sz w:val="20"/>
+      </w:rPr>
+    </w:lvl>
+    <w:lvl w:ilvl="7" w:tentative="1">
+      <w:start w:val="1"/>
+      <w:numFmt w:val="bullet"/>
+      <w:lvlText w:val=""/>
+      <w:lvlJc w:val="left"/>
+      <w:pPr>
+        <w:tabs>
+          <w:tab w:val="num" w:pos="5760"/>
+        </w:tabs>
+        <w:ind w:left="5760" w:hanging="360"/>
+      </w:pPr>
+      <w:rPr>
+        <w:rFonts w:ascii="Wingdings" w:hAnsi="Wingdings" w:hint="default"/>
+        <w:sz w:val="20"/>
+      </w:rPr>
+    </w:lvl>
+    <w:lvl w:ilvl="8" w:tentative="1">
+      <w:start w:val="1"/>
+      <w:numFmt w:val="bullet"/>
+      <w:lvlText w:val=""/>
+      <w:lvlJc w:val="left"/>
+      <w:pPr>
+        <w:tabs>
+          <w:tab w:val="num" w:pos="6480"/>
+        </w:tabs>
+        <w:ind w:left="6480" w:hanging="360"/>
+      </w:pPr>
+      <w:rPr>
+        <w:rFonts w:ascii="Wingdings" w:hAnsi="Wingdings" w:hint="default"/>
+        <w:sz w:val="20"/>
+      </w:rPr>
+    </w:lvl>
+  </w:abstractNum>
+  <w:abstractNum w:abstractNumId="2" w15:restartNumberingAfterBreak="0">
+    <w:nsid w:val="6F1B38D8"/>
+    <w:multiLevelType w:val="multilevel"/>
+    <w:tmpl w:val="E0B061AC"/>
+    <w:lvl w:ilvl="0">
+      <w:start w:val="1"/>
+      <w:numFmt w:val="decimal"/>
+      <w:lvlText w:val="%1."/>
+      <w:lvlJc w:val="left"/>
+      <w:pPr>
+        <w:tabs>
+          <w:tab w:val="num" w:pos="720"/>
+        </w:tabs>
+        <w:ind w:left="720" w:hanging="360"/>
+      </w:pPr>
+    </w:lvl>
+    <w:lvl w:ilvl="1" w:tentative="1">
+      <w:start w:val="1"/>
+      <w:numFmt w:val="decimal"/>
+      <w:lvlText w:val="%2."/>
+      <w:lvlJc w:val="left"/>
+      <w:pPr>
+        <w:tabs>
+          <w:tab w:val="num" w:pos="1440"/>
+        </w:tabs>
+        <w:ind w:left="1440" w:hanging="360"/>
+      </w:pPr>
+    </w:lvl>
+    <w:lvl w:ilvl="2" w:tentative="1">
+      <w:start w:val="1"/>
+      <w:numFmt w:val="decimal"/>
+      <w:lvlText w:val="%3."/>
+      <w:lvlJc w:val="left"/>
+      <w:pPr>
+        <w:tabs>
+          <w:tab w:val="num" w:pos="2160"/>
+        </w:tabs>
+        <w:ind w:left="2160" w:hanging="360"/>
+      </w:pPr>
+    </w:lvl>
+    <w:lvl w:ilvl="3" w:tentative="1">
+      <w:start w:val="1"/>
+      <w:numFmt w:val="decimal"/>
+      <w:lvlText w:val="%4."/>
+      <w:lvlJc w:val="left"/>
+      <w:pPr>
+        <w:tabs>
+          <w:tab w:val="num" w:pos="2880"/>
+        </w:tabs>
+        <w:ind w:left="2880" w:hanging="360"/>
+      </w:pPr>
+    </w:lvl>
+    <w:lvl w:ilvl="4" w:tentative="1">
+      <w:start w:val="1"/>
+      <w:numFmt w:val="decimal"/>
+      <w:lvlText w:val="%5."/>
+      <w:lvlJc w:val="left"/>
+      <w:pPr>
+        <w:tabs>
+          <w:tab w:val="num" w:pos="3600"/>
+        </w:tabs>
+        <w:ind w:left="3600" w:hanging="360"/>
+      </w:pPr>
+    </w:lvl>
+    <w:lvl w:ilvl="5" w:tentative="1">
+      <w:start w:val="1"/>
+      <w:numFmt w:val="decimal"/>
+      <w:lvlText w:val="%6."/>
+      <w:lvlJc w:val="left"/>
+      <w:pPr>
+        <w:tabs>
+          <w:tab w:val="num" w:pos="4320"/>
+        </w:tabs>
+        <w:ind w:left="4320" w:hanging="360"/>
+      </w:pPr>
+    </w:lvl>
+    <w:lvl w:ilvl="6" w:tentative="1">
+      <w:start w:val="1"/>
+      <w:numFmt w:val="decimal"/>
+      <w:lvlText w:val="%7."/>
+      <w:lvlJc w:val="left"/>
+      <w:pPr>
+        <w:tabs>
+          <w:tab w:val="num" w:pos="5040"/>
+        </w:tabs>
+        <w:ind w:left="5040" w:hanging="360"/>
+      </w:pPr>
+    </w:lvl>
+    <w:lvl w:ilvl="7" w:tentative="1">
+      <w:start w:val="1"/>
+      <w:numFmt w:val="decimal"/>
+      <w:lvlText w:val="%8."/>
+      <w:lvlJc w:val="left"/>
+      <w:pPr>
+        <w:tabs>
+          <w:tab w:val="num" w:pos="5760"/>
+        </w:tabs>
+        <w:ind w:left="5760" w:hanging="360"/>
+      </w:pPr>
+    </w:lvl>
+    <w:lvl w:ilvl="8" w:tentative="1">
+      <w:start w:val="1"/>
+      <w:numFmt w:val="decimal"/>
+      <w:lvlText w:val="%9."/>
+      <w:lvlJc w:val="left"/>
+      <w:pPr>
+        <w:tabs>
+          <w:tab w:val="num" w:pos="6480"/>
+        </w:tabs>
+        <w:ind w:left="6480" w:hanging="360"/>
+      </w:pPr>
+    </w:lvl>
+  </w:abstractNum>
   <w:num w:numId="1" w16cid:durableId="897862257">
     <w:abstractNumId w:val="0"/>
+  </w:num>
+  <w:num w:numId="2" w16cid:durableId="998263786">
+    <w:abstractNumId w:val="1"/>
+  </w:num>
+  <w:num w:numId="3" w16cid:durableId="1359888826">
+    <w:abstractNumId w:val="2"/>
   </w:num>
 </w:numbering>
 </file>
@@ -3564,7 +5181,7 @@
       <w:spacing w:after="200" w:line="276" w:lineRule="auto"/>
     </w:pPr>
   </w:style>
-  <w:style w:type="character" w:default="1" w:styleId="Fontepargpadro">
+  <w:style w:type="character" w:default="1" w:styleId="Tipodeletrapredefinidodopargrafo">
     <w:name w:val="Default Paragraph Font"/>
     <w:uiPriority w:val="1"/>
     <w:semiHidden/>
@@ -3594,7 +5211,7 @@
   <w:style w:type="paragraph" w:styleId="Cabealho">
     <w:name w:val="header"/>
     <w:basedOn w:val="Normal"/>
-    <w:link w:val="CabealhoChar"/>
+    <w:link w:val="CabealhoCarter"/>
     <w:uiPriority w:val="99"/>
     <w:unhideWhenUsed/>
     <w:rsid w:val="000425C6"/>
@@ -3606,9 +5223,9 @@
       <w:spacing w:after="0" w:line="240" w:lineRule="auto"/>
     </w:pPr>
   </w:style>
-  <w:style w:type="character" w:customStyle="1" w:styleId="CabealhoChar">
-    <w:name w:val="Cabeçalho Char"/>
-    <w:basedOn w:val="Fontepargpadro"/>
+  <w:style w:type="character" w:customStyle="1" w:styleId="CabealhoCarter">
+    <w:name w:val="Cabeçalho Caráter"/>
+    <w:basedOn w:val="Tipodeletrapredefinidodopargrafo"/>
     <w:link w:val="Cabealho"/>
     <w:uiPriority w:val="99"/>
     <w:rsid w:val="000425C6"/>
@@ -3616,7 +5233,7 @@
   <w:style w:type="paragraph" w:styleId="Rodap">
     <w:name w:val="footer"/>
     <w:basedOn w:val="Normal"/>
-    <w:link w:val="RodapChar"/>
+    <w:link w:val="RodapCarter"/>
     <w:uiPriority w:val="99"/>
     <w:unhideWhenUsed/>
     <w:rsid w:val="000425C6"/>
@@ -3628,12 +5245,35 @@
       <w:spacing w:after="0" w:line="240" w:lineRule="auto"/>
     </w:pPr>
   </w:style>
-  <w:style w:type="character" w:customStyle="1" w:styleId="RodapChar">
-    <w:name w:val="Rodapé Char"/>
-    <w:basedOn w:val="Fontepargpadro"/>
+  <w:style w:type="character" w:customStyle="1" w:styleId="RodapCarter">
+    <w:name w:val="Rodapé Caráter"/>
+    <w:basedOn w:val="Tipodeletrapredefinidodopargrafo"/>
     <w:link w:val="Rodap"/>
     <w:uiPriority w:val="99"/>
     <w:rsid w:val="000425C6"/>
+  </w:style>
+  <w:style w:type="character" w:styleId="Hiperligao">
+    <w:name w:val="Hyperlink"/>
+    <w:basedOn w:val="Tipodeletrapredefinidodopargrafo"/>
+    <w:uiPriority w:val="99"/>
+    <w:unhideWhenUsed/>
+    <w:rsid w:val="00F955AE"/>
+    <w:rPr>
+      <w:color w:val="0563C1" w:themeColor="hyperlink"/>
+      <w:u w:val="single"/>
+    </w:rPr>
+  </w:style>
+  <w:style w:type="character" w:styleId="MenoNoResolvida">
+    <w:name w:val="Unresolved Mention"/>
+    <w:basedOn w:val="Tipodeletrapredefinidodopargrafo"/>
+    <w:uiPriority w:val="99"/>
+    <w:semiHidden/>
+    <w:unhideWhenUsed/>
+    <w:rsid w:val="00F955AE"/>
+    <w:rPr>
+      <w:color w:val="605E5C"/>
+      <w:shd w:val="clear" w:color="auto" w:fill="E1DFDD"/>
+    </w:rPr>
   </w:style>
 </w:styles>
 </file>

</xml_diff>